<commit_message>
docs: Vircle Doc Sign revised for Word files, categories and add-ons (Merchant Registration), signing list and order
Co-Authored-By: Claude Sonnet 5.5 <noreply@anthropic.com>
</commit_message>
<xml_diff>
--- a/docs/vircle-sign-features.docx
+++ b/docs/vircle-sign-features.docx
@@ -7,7 +7,7 @@
         <w:pStyle w:val="Title"/>
       </w:pPr>
       <w:r>
-        <w:t xml:space="preserve">Halo Sign: feature set</w:t>
+        <w:t xml:space="preserve">Vircle Doc Sign: feature set</w:t>
       </w:r>
     </w:p>
     <w:p>
@@ -15,7 +15,7 @@
         <w:pStyle w:val="Subtitle"/>
       </w:pPr>
       <w:r>
-        <w:t xml:space="preserve">Document 1 of 3 for review. Requirements, scope and acceptance, 6 Oct 2026</w:t>
+        <w:t xml:space="preserve">Document 1 of 3 for review. Requirements, scope and acceptance, revised 6 Oct 2026</w:t>
       </w:r>
     </w:p>
     <w:sdt>
@@ -58,19 +58,7 @@
         <w:pStyle w:val="FirstParagraph"/>
       </w:pPr>
       <w:r>
-        <w:t xml:space="preserve">Halo Sign is a native document-signing module inside Halo. It lets a workspace turn a form or</w:t>
-      </w:r>
-      <w:r>
-        <w:t xml:space="preserve"> </w:t>
-      </w:r>
-      <w:r>
-        <w:t xml:space="preserve">contract into a template, send it to one or more people for electronic signature, store the signed</w:t>
-      </w:r>
-      <w:r>
-        <w:t xml:space="preserve"> </w:t>
-      </w:r>
-      <w:r>
-        <w:t xml:space="preserve">result safely, and manage documents afterwards. The first use is</w:t>
+        <w:t xml:space="preserve">Vircle Doc Sign is a native document-signing module inside Halo. It works on</w:t>
       </w:r>
       <w:r>
         <w:t xml:space="preserve"> </w:t>
@@ -80,22 +68,139 @@
           <w:b/>
           <w:bCs/>
         </w:rPr>
-        <w:t xml:space="preserve">merchant registration</w:t>
-      </w:r>
-      <w:r>
-        <w:t xml:space="preserve">: a</w:t>
-      </w:r>
-      <w:r>
-        <w:t xml:space="preserve"> </w:t>
-      </w:r>
-      <w:r>
-        <w:t xml:space="preserve">merchant applies, receives an agreement prefilled with their details, signs on their phone, and the</w:t>
-      </w:r>
-      <w:r>
-        <w:t xml:space="preserve"> </w:t>
-      </w:r>
-      <w:r>
-        <w:t xml:space="preserve">signed file lands on their record in Halo with no manual handling.</w:t>
+        <w:t xml:space="preserve">any document</w:t>
+      </w:r>
+      <w:r>
+        <w:t xml:space="preserve">: upload</w:t>
+      </w:r>
+      <w:r>
+        <w:t xml:space="preserve"> </w:t>
+      </w:r>
+      <w:r>
+        <w:t xml:space="preserve">a PDF, a Word file or an image, place signing locations, text, date and number fields on it, name</w:t>
+      </w:r>
+      <w:r>
+        <w:t xml:space="preserve"> </w:t>
+      </w:r>
+      <w:r>
+        <w:t xml:space="preserve">the people who must sign (in a set order if you wish), send it for electronic signature, store the</w:t>
+      </w:r>
+      <w:r>
+        <w:t xml:space="preserve"> </w:t>
+      </w:r>
+      <w:r>
+        <w:t xml:space="preserve">signed result safely, and manage documents afterwards. Documents are organised into</w:t>
+      </w:r>
+      <w:r>
+        <w:t xml:space="preserve"> </w:t>
+      </w:r>
+      <w:r>
+        <w:rPr>
+          <w:b/>
+          <w:bCs/>
+        </w:rPr>
+        <w:t xml:space="preserve">categories</w:t>
+      </w:r>
+      <w:r>
+        <w:t xml:space="preserve">,</w:t>
+      </w:r>
+      <w:r>
+        <w:t xml:space="preserve"> </w:t>
+      </w:r>
+      <w:r>
+        <w:t xml:space="preserve">and ready-made packs for a business process come as</w:t>
+      </w:r>
+      <w:r>
+        <w:t xml:space="preserve"> </w:t>
+      </w:r>
+      <w:r>
+        <w:rPr>
+          <w:b/>
+          <w:bCs/>
+        </w:rPr>
+        <w:t xml:space="preserve">add-ons</w:t>
+      </w:r>
+      <w:r>
+        <w:t xml:space="preserve">. The first add-on is</w:t>
+      </w:r>
+      <w:r>
+        <w:t xml:space="preserve"> </w:t>
+      </w:r>
+      <w:r>
+        <w:rPr>
+          <w:b/>
+          <w:bCs/>
+        </w:rPr>
+        <w:t xml:space="preserve">Merchant</w:t>
+      </w:r>
+      <w:r>
+        <w:rPr>
+          <w:b/>
+          <w:bCs/>
+        </w:rPr>
+        <w:t xml:space="preserve"> </w:t>
+      </w:r>
+      <w:r>
+        <w:rPr>
+          <w:b/>
+          <w:bCs/>
+        </w:rPr>
+        <w:t xml:space="preserve">Registration</w:t>
+      </w:r>
+      <w:r>
+        <w:t xml:space="preserve">: a merchant applies, receives the merchant agreement prefilled with their details,</w:t>
+      </w:r>
+      <w:r>
+        <w:t xml:space="preserve"> </w:t>
+      </w:r>
+      <w:r>
+        <w:t xml:space="preserve">signs on their phone, and the signed file lands on their record in Halo with no manual handling. A</w:t>
+      </w:r>
+      <w:r>
+        <w:t xml:space="preserve"> </w:t>
+      </w:r>
+      <w:r>
+        <w:t xml:space="preserve">workspace without an add-on still has the whole core product.</w:t>
+      </w:r>
+    </w:p>
+    <w:p>
+      <w:pPr>
+        <w:pStyle w:val="BodyText"/>
+      </w:pPr>
+      <w:r>
+        <w:rPr>
+          <w:i/>
+          <w:iCs/>
+        </w:rPr>
+        <w:t xml:space="preserve">Revised after your note that the merchant agreement is an add-on template and category, that Word</w:t>
+      </w:r>
+      <w:r>
+        <w:rPr>
+          <w:i/>
+          <w:iCs/>
+        </w:rPr>
+        <w:t xml:space="preserve"> </w:t>
+      </w:r>
+      <w:r>
+        <w:rPr>
+          <w:i/>
+          <w:iCs/>
+        </w:rPr>
+        <w:t xml:space="preserve">files and any-document editing are needed, and that signers are listed with full name, email and an</w:t>
+      </w:r>
+      <w:r>
+        <w:rPr>
+          <w:i/>
+          <w:iCs/>
+        </w:rPr>
+        <w:t xml:space="preserve"> </w:t>
+      </w:r>
+      <w:r>
+        <w:rPr>
+          <w:i/>
+          <w:iCs/>
+        </w:rPr>
+        <w:t xml:space="preserve">optional signing order. Changes are in sections 3.1, 3.2, 3.9, 3.10 and 3.11.</w:t>
       </w:r>
     </w:p>
     <w:p>
@@ -354,10 +459,22 @@
           <w:b/>
           <w:bCs/>
         </w:rPr>
-        <w:t xml:space="preserve">PDF only</w:t>
-      </w:r>
-      <w:r>
-        <w:t xml:space="preserve">. Word files are not accepted in v1 (convert before uploading).</w:t>
+        <w:t xml:space="preserve">PDF, Word (.docx, .doc) and images (JPG, PNG)</w:t>
+      </w:r>
+      <w:r>
+        <w:t xml:space="preserve">. Word files are converted to PDF by a</w:t>
+      </w:r>
+      <w:r>
+        <w:t xml:space="preserve"> </w:t>
+      </w:r>
+      <w:r>
+        <w:t xml:space="preserve">conversion service and the converted PDF is what is signed; the original is kept. Exact page</w:t>
+      </w:r>
+      <w:r>
+        <w:t xml:space="preserve"> </w:t>
+      </w:r>
+      <w:r>
+        <w:t xml:space="preserve">layout of a Word file depends on its fonts; where it must be exact, upload a PDF.</w:t>
       </w:r>
     </w:p>
     <w:p>
@@ -426,6 +543,67 @@
       </w:r>
       <w:r>
         <w:t xml:space="preserve">workspace is deleted, as an explicit exception. This needs your decision.</w:t>
+      </w:r>
+    </w:p>
+    <w:p>
+      <w:pPr>
+        <w:pStyle w:val="Compact"/>
+        <w:numPr>
+          <w:ilvl w:val="0"/>
+          <w:numId w:val="1002"/>
+        </w:numPr>
+      </w:pPr>
+      <w:r>
+        <w:t xml:space="preserve">The product name is</w:t>
+      </w:r>
+      <w:r>
+        <w:t xml:space="preserve"> </w:t>
+      </w:r>
+      <w:r>
+        <w:rPr>
+          <w:b/>
+          <w:bCs/>
+        </w:rPr>
+        <w:t xml:space="preserve">Vircle Doc Sign</w:t>
+      </w:r>
+      <w:r>
+        <w:t xml:space="preserve">; the sidebar says</w:t>
+      </w:r>
+      <w:r>
+        <w:t xml:space="preserve"> </w:t>
+      </w:r>
+      <w:r>
+        <w:t xml:space="preserve">“Doc Sign”</w:t>
+      </w:r>
+      <w:r>
+        <w:t xml:space="preserve">. Customer-facing pages and</w:t>
+      </w:r>
+      <w:r>
+        <w:t xml:space="preserve"> </w:t>
+      </w:r>
+      <w:r>
+        <w:t xml:space="preserve">emails use the workspace’s name and</w:t>
+      </w:r>
+      <w:r>
+        <w:t xml:space="preserve"> </w:t>
+      </w:r>
+      <w:r>
+        <w:t xml:space="preserve">“Halo”</w:t>
+      </w:r>
+      <w:r>
+        <w:t xml:space="preserve">. Because Halo’s help pages must not name Vircle, the</w:t>
+      </w:r>
+      <w:r>
+        <w:t xml:space="preserve"> </w:t>
+      </w:r>
+      <w:r>
+        <w:t xml:space="preserve">Doc Sign help pages are owner-only while the module is Vircle-only. If it is later sold to</w:t>
+      </w:r>
+      <w:r>
+        <w:t xml:space="preserve"> </w:t>
+      </w:r>
+      <w:r>
+        <w:t xml:space="preserve">customers, the brand on customer-facing wording is a decision to take then.</w:t>
       </w:r>
     </w:p>
     <w:bookmarkEnd w:id="9"/>
@@ -517,18 +695,18 @@
               <w:pStyle w:val="Compact"/>
             </w:pPr>
             <w:r>
-              <w:t xml:space="preserve">Sends documents, follows progress, resends, voids</w:t>
-            </w:r>
-          </w:p>
-        </w:tc>
-        <w:tc>
-          <w:tcPr/>
-          <w:p>
-            <w:pPr>
-              <w:pStyle w:val="Compact"/>
-            </w:pPr>
-            <w:r>
-              <w:t xml:space="preserve">Halo, Sign section and contact page</w:t>
+              <w:t xml:space="preserve">Uploads or picks a document, lists the signers, sends, follows progress, resends, voids</w:t>
+            </w:r>
+          </w:p>
+        </w:tc>
+        <w:tc>
+          <w:tcPr/>
+          <w:p>
+            <w:pPr>
+              <w:pStyle w:val="Compact"/>
+            </w:pPr>
+            <w:r>
+              <w:t xml:space="preserve">Halo, Doc Sign section and contact page</w:t>
             </w:r>
           </w:p>
         </w:tc>
@@ -573,7 +751,7 @@
               <w:pStyle w:val="Compact"/>
             </w:pPr>
             <w:r>
-              <w:t xml:space="preserve">Halo, Sign &gt; Templates</w:t>
+              <w:t xml:space="preserve">Halo, Doc Sign &gt; Templates</w:t>
             </w:r>
           </w:p>
         </w:tc>
@@ -760,7 +938,7 @@
       </w:tr>
     </w:tbl>
     <w:bookmarkEnd w:id="10"/>
-    <w:bookmarkStart w:id="19" w:name="feature-list"/>
+    <w:bookmarkStart w:id="22" w:name="feature-list"/>
     <w:p>
       <w:pPr>
         <w:pStyle w:val="Heading1"/>
@@ -847,7 +1025,7 @@
               <w:pStyle w:val="Compact"/>
             </w:pPr>
             <w:r>
-              <w:t xml:space="preserve">Upload a PDF as a template (up to 25 MB, 50 pages). Reject password-protected or corrupt files with a clear message.</w:t>
+              <w:t xml:space="preserve">Upload a PDF, Word file or image as a template or as a one-off document (up to 25 MB, 50 pages). Reject password-protected, corrupt or unsupported files with a clear message.</w:t>
             </w:r>
           </w:p>
         </w:tc>
@@ -917,7 +1095,59 @@
               <w:pStyle w:val="Compact"/>
             </w:pPr>
             <w:r>
-              <w:t xml:space="preserve">Field types: signature, initials, full name, date signed (automatic), text, multi-line text, email, phone, number, checkbox, dropdown, radio group,</w:t>
+              <w:t xml:space="preserve">Field types: signature, initials, full name,</w:t>
+            </w:r>
+            <w:r>
+              <w:t xml:space="preserve"> </w:t>
+            </w:r>
+            <w:r>
+              <w:rPr>
+                <w:b/>
+                <w:bCs/>
+              </w:rPr>
+              <w:t xml:space="preserve">date signed (automatic)</w:t>
+            </w:r>
+            <w:r>
+              <w:t xml:space="preserve">,</w:t>
+            </w:r>
+            <w:r>
+              <w:t xml:space="preserve"> </w:t>
+            </w:r>
+            <w:r>
+              <w:rPr>
+                <w:b/>
+                <w:bCs/>
+              </w:rPr>
+              <w:t xml:space="preserve">date the signer picks</w:t>
+            </w:r>
+            <w:r>
+              <w:t xml:space="preserve">, text, multi-line text, email, phone,</w:t>
+            </w:r>
+            <w:r>
+              <w:t xml:space="preserve"> </w:t>
+            </w:r>
+            <w:r>
+              <w:rPr>
+                <w:b/>
+                <w:bCs/>
+              </w:rPr>
+              <w:t xml:space="preserve">number (decimals, currency symbol, minimum and maximum)</w:t>
+            </w:r>
+            <w:r>
+              <w:t xml:space="preserve">, checkbox, dropdown, radio group,</w:t>
+            </w:r>
+            <w:r>
+              <w:t xml:space="preserve"> </w:t>
+            </w:r>
+            <w:r>
+              <w:rPr>
+                <w:b/>
+                <w:bCs/>
+              </w:rPr>
+              <w:t xml:space="preserve">static text the sender writes on the document</w:t>
+            </w:r>
+            <w:r>
+              <w:t xml:space="preserve">, and</w:t>
             </w:r>
             <w:r>
               <w:t xml:space="preserve"> </w:t>
@@ -978,7 +1208,7 @@
               <w:t xml:space="preserve"> </w:t>
             </w:r>
             <w:r>
-              <w:t xml:space="preserve">per template (for example Merchant, Vircle Director). Each field belongs to a role. Up to 6 roles.</w:t>
+              <w:t xml:space="preserve">per template or document (for example Merchant, Director). Each field belongs to a role. Up to 6 roles. Roles are filled from the signing list (F-66).</w:t>
             </w:r>
           </w:p>
         </w:tc>
@@ -1138,7 +1368,7 @@
               <w:pStyle w:val="Compact"/>
             </w:pPr>
             <w:r>
-              <w:t xml:space="preserve">Template defaults: signing order (parallel or in sequence), expiry in days, reminder schedule, email subject and message, which language to open in.</w:t>
+              <w:t xml:space="preserve">Template defaults: roles and their order, whether signing follows the order, expiry in days, reminder schedule, email subject and message, which language to open in, and the category.</w:t>
             </w:r>
           </w:p>
         </w:tc>
@@ -1416,7 +1646,23 @@
               <w:pStyle w:val="Compact"/>
             </w:pPr>
             <w:r>
-              <w:t xml:space="preserve">Recipients: name, email, phone, role, channel (email, WhatsApp or both) and order. A recipient can be a Halo contact.</w:t>
+              <w:t xml:space="preserve">Recipients are entered in the</w:t>
+            </w:r>
+            <w:r>
+              <w:t xml:space="preserve"> </w:t>
+            </w:r>
+            <w:r>
+              <w:rPr>
+                <w:b/>
+                <w:bCs/>
+              </w:rPr>
+              <w:t xml:space="preserve">signing list</w:t>
+            </w:r>
+            <w:r>
+              <w:t xml:space="preserve"> </w:t>
+            </w:r>
+            <w:r>
+              <w:t xml:space="preserve">(F-66 to F-72): full name, email, role, channel (email, WhatsApp or both) and order. A recipient can be a Halo contact.</w:t>
             </w:r>
           </w:p>
         </w:tc>
@@ -1451,7 +1697,7 @@
               <w:pStyle w:val="Compact"/>
             </w:pPr>
             <w:r>
-              <w:t xml:space="preserve">One-off document: upload a PDF and place fields without saving a template.</w:t>
+              <w:t xml:space="preserve">One-off document: upload any supported file, place fields and send without saving a template (see F-73).</w:t>
             </w:r>
           </w:p>
         </w:tc>
@@ -1792,7 +2038,7 @@
               <w:pStyle w:val="Compact"/>
             </w:pPr>
             <w:r>
-              <w:t xml:space="preserve">Next signer is notified automatically when the previous one finishes (sequential signing).</w:t>
+              <w:t xml:space="preserve">When signing follows an order, the next step is invited automatically when the previous one finishes (see F-67 to F-69).</w:t>
             </w:r>
           </w:p>
         </w:tc>
@@ -4000,477 +4246,13 @@
       </w:tr>
     </w:tbl>
     <w:bookmarkEnd w:id="18"/>
-    <w:bookmarkEnd w:id="19"/>
-    <w:bookmarkStart w:id="20" w:name="out-of-scope-for-now"/>
+    <w:bookmarkStart w:id="19" w:name="the-signing-list-and-order"/>
     <w:p>
       <w:pPr>
-        <w:pStyle w:val="Heading1"/>
-      </w:pPr>
-      <w:r>
-        <w:t xml:space="preserve">4. Out of scope for now</w:t>
-      </w:r>
-    </w:p>
-    <w:p>
-      <w:pPr>
-        <w:pStyle w:val="FirstParagraph"/>
-      </w:pPr>
-      <w:r>
-        <w:t xml:space="preserve">In-person (hand-over device) signing, Word and Excel input, SMS delivery, face or ID-card</w:t>
-      </w:r>
-      <w:r>
-        <w:t xml:space="preserve"> </w:t>
-      </w:r>
-      <w:r>
-        <w:t xml:space="preserve">verification (eKYC), conditional fields, payment fields, per-tenant custom domains for the signing</w:t>
-      </w:r>
-      <w:r>
-        <w:t xml:space="preserve"> </w:t>
-      </w:r>
-      <w:r>
-        <w:t xml:space="preserve">page, embedding the editor in other sites, and signatures by licensed certificate authority per</w:t>
-      </w:r>
-      <w:r>
-        <w:t xml:space="preserve"> </w:t>
-      </w:r>
-      <w:r>
-        <w:t xml:space="preserve">signer (the P3 certificate is for sealing, not per person).</w:t>
-      </w:r>
-    </w:p>
-    <w:bookmarkEnd w:id="20"/>
-    <w:bookmarkStart w:id="21" w:name="X97b51b3c38bee91f8e24d0090b0ad304f6464fc"/>
-    <w:p>
-      <w:pPr>
-        <w:pStyle w:val="Heading1"/>
-      </w:pPr>
-      <w:r>
-        <w:t xml:space="preserve">5. Merchant registration: the target end-to-end flow</w:t>
-      </w:r>
-    </w:p>
-    <w:p>
-      <w:pPr>
-        <w:pStyle w:val="Compact"/>
-        <w:numPr>
-          <w:ilvl w:val="0"/>
-          <w:numId w:val="1003"/>
-        </w:numPr>
-      </w:pPr>
-      <w:r>
-        <w:t xml:space="preserve">A merchant fills the</w:t>
-      </w:r>
-      <w:r>
-        <w:t xml:space="preserve"> </w:t>
-      </w:r>
-      <w:r>
-        <w:rPr>
-          <w:b/>
-          <w:bCs/>
-        </w:rPr>
-        <w:t xml:space="preserve">registration form</w:t>
-      </w:r>
-      <w:r>
-        <w:t xml:space="preserve"> </w:t>
-      </w:r>
-      <w:r>
-        <w:t xml:space="preserve">(P3) or an agent creates the contact (P1). The</w:t>
-      </w:r>
-      <w:r>
-        <w:t xml:space="preserve"> </w:t>
-      </w:r>
-      <w:r>
-        <w:t xml:space="preserve">contact receives the tag</w:t>
-      </w:r>
-      <w:r>
-        <w:t xml:space="preserve"> </w:t>
-      </w:r>
-      <w:r>
-        <w:t xml:space="preserve">“Merchant applicant”</w:t>
-      </w:r>
-      <w:r>
-        <w:t xml:space="preserve"> </w:t>
-      </w:r>
-      <w:r>
-        <w:t xml:space="preserve">and the business details in custom fields.</w:t>
-      </w:r>
-    </w:p>
-    <w:p>
-      <w:pPr>
-        <w:pStyle w:val="Compact"/>
-        <w:numPr>
-          <w:ilvl w:val="0"/>
-          <w:numId w:val="1003"/>
-        </w:numPr>
-      </w:pPr>
-      <w:r>
-        <w:t xml:space="preserve">The automation</w:t>
-      </w:r>
-      <w:r>
-        <w:t xml:space="preserve"> </w:t>
-      </w:r>
-      <w:r>
-        <w:t xml:space="preserve">“Merchant onboarding”</w:t>
-      </w:r>
-      <w:r>
-        <w:t xml:space="preserve"> </w:t>
-      </w:r>
-      <w:r>
-        <w:t xml:space="preserve">(P2) starts: it sends</w:t>
-      </w:r>
-      <w:r>
-        <w:t xml:space="preserve"> </w:t>
-      </w:r>
-      <w:r>
-        <w:rPr>
-          <w:b/>
-          <w:bCs/>
-        </w:rPr>
-        <w:t xml:space="preserve">Merchant Agreement</w:t>
-      </w:r>
-      <w:r>
-        <w:t xml:space="preserve"> </w:t>
-      </w:r>
-      <w:r>
-        <w:t xml:space="preserve">to the</w:t>
-      </w:r>
-      <w:r>
-        <w:t xml:space="preserve"> </w:t>
-      </w:r>
-      <w:r>
-        <w:t xml:space="preserve">merchant by WhatsApp and email. Fields the merchant must complete: signature, company registration</w:t>
-      </w:r>
-      <w:r>
-        <w:t xml:space="preserve"> </w:t>
-      </w:r>
-      <w:r>
-        <w:t xml:space="preserve">number, authorised person’s IC number, bank account, upload of the business registration</w:t>
-      </w:r>
-      <w:r>
-        <w:t xml:space="preserve"> </w:t>
-      </w:r>
-      <w:r>
-        <w:t xml:space="preserve">certificate and an ID copy.</w:t>
-      </w:r>
-    </w:p>
-    <w:p>
-      <w:pPr>
-        <w:pStyle w:val="Compact"/>
-        <w:numPr>
-          <w:ilvl w:val="0"/>
-          <w:numId w:val="1003"/>
-        </w:numPr>
-      </w:pPr>
-      <w:r>
-        <w:t xml:space="preserve">The merchant opens the link on their phone, enters the code, reads, fills, signs.</w:t>
-      </w:r>
-    </w:p>
-    <w:p>
-      <w:pPr>
-        <w:pStyle w:val="Compact"/>
-        <w:numPr>
-          <w:ilvl w:val="0"/>
-          <w:numId w:val="1003"/>
-        </w:numPr>
-      </w:pPr>
-      <w:r>
-        <w:t xml:space="preserve">The countersigner (Vircle Director) is notified in Halo and signs (P2).</w:t>
-      </w:r>
-    </w:p>
-    <w:p>
-      <w:pPr>
-        <w:pStyle w:val="Compact"/>
-        <w:numPr>
-          <w:ilvl w:val="0"/>
-          <w:numId w:val="1003"/>
-        </w:numPr>
-      </w:pPr>
-      <w:r>
-        <w:t xml:space="preserve">The sealed PDF and certificate are saved to the contact. The contact’s stage becomes</w:t>
-      </w:r>
-      <w:r>
-        <w:t xml:space="preserve"> </w:t>
-      </w:r>
-      <w:r>
-        <w:t xml:space="preserve">“Merchant</w:t>
-      </w:r>
-      <w:r>
-        <w:t xml:space="preserve"> </w:t>
-      </w:r>
-      <w:r>
-        <w:t xml:space="preserve">signed”</w:t>
-      </w:r>
-      <w:r>
-        <w:t xml:space="preserve">. A ticket</w:t>
-      </w:r>
-      <w:r>
-        <w:t xml:space="preserve"> </w:t>
-      </w:r>
-      <w:r>
-        <w:t xml:space="preserve">“Merchant KYC review”</w:t>
-      </w:r>
-      <w:r>
-        <w:t xml:space="preserve"> </w:t>
-      </w:r>
-      <w:r>
-        <w:t xml:space="preserve">is opened for the Merchant Operations team with the</w:t>
-      </w:r>
-      <w:r>
-        <w:t xml:space="preserve"> </w:t>
-      </w:r>
-      <w:r>
-        <w:t xml:space="preserve">documents attached.</w:t>
-      </w:r>
-    </w:p>
-    <w:p>
-      <w:pPr>
-        <w:pStyle w:val="Compact"/>
-        <w:numPr>
-          <w:ilvl w:val="0"/>
-          <w:numId w:val="1003"/>
-        </w:numPr>
-      </w:pPr>
-      <w:r>
-        <w:t xml:space="preserve">A webhook tells the merchant backend that the merchant is ready for activation. The merchant is</w:t>
-      </w:r>
-      <w:r>
-        <w:t xml:space="preserve"> </w:t>
-      </w:r>
-      <w:r>
-        <w:t xml:space="preserve">sent a welcome message with their signed copy.</w:t>
-      </w:r>
-    </w:p>
-    <w:p>
-      <w:pPr>
-        <w:pStyle w:val="FirstParagraph"/>
-      </w:pPr>
-      <w:r>
-        <w:t xml:space="preserve">Until P2, steps 2, 4 and 6 are manual: an agent sends from the contact page, countersigns, and</w:t>
-      </w:r>
-      <w:r>
-        <w:t xml:space="preserve"> </w:t>
-      </w:r>
-      <w:r>
-        <w:t xml:space="preserve">reads the completion email.</w:t>
-      </w:r>
-    </w:p>
-    <w:bookmarkEnd w:id="21"/>
-    <w:bookmarkStart w:id="22" w:name="rules-the-module-must-obey"/>
-    <w:p>
-      <w:pPr>
-        <w:pStyle w:val="Heading1"/>
-      </w:pPr>
-      <w:r>
-        <w:t xml:space="preserve">6. Rules the module must obey</w:t>
-      </w:r>
-    </w:p>
-    <w:p>
-      <w:pPr>
-        <w:pStyle w:val="Compact"/>
-        <w:numPr>
-          <w:ilvl w:val="0"/>
-          <w:numId w:val="1004"/>
-        </w:numPr>
-      </w:pPr>
-      <w:r>
-        <w:rPr>
-          <w:b/>
-          <w:bCs/>
-        </w:rPr>
-        <w:t xml:space="preserve">Tenant isolation.</w:t>
-      </w:r>
-      <w:r>
-        <w:t xml:space="preserve"> </w:t>
-      </w:r>
-      <w:r>
-        <w:t xml:space="preserve">Every table carries the workspace id and is protected by row-level</w:t>
-      </w:r>
-      <w:r>
-        <w:t xml:space="preserve"> </w:t>
-      </w:r>
-      <w:r>
-        <w:t xml:space="preserve">security. Signers reach their document only through their private link and never see another</w:t>
-      </w:r>
-      <w:r>
-        <w:t xml:space="preserve"> </w:t>
-      </w:r>
-      <w:r>
-        <w:t xml:space="preserve">document.</w:t>
-      </w:r>
-    </w:p>
-    <w:p>
-      <w:pPr>
-        <w:pStyle w:val="Compact"/>
-        <w:numPr>
-          <w:ilvl w:val="0"/>
-          <w:numId w:val="1004"/>
-        </w:numPr>
-      </w:pPr>
-      <w:r>
-        <w:rPr>
-          <w:b/>
-          <w:bCs/>
-        </w:rPr>
-        <w:t xml:space="preserve">Immutability.</w:t>
-      </w:r>
-      <w:r>
-        <w:t xml:space="preserve"> </w:t>
-      </w:r>
-      <w:r>
-        <w:t xml:space="preserve">A sealed file and its audit trail cannot be changed by anyone, including</w:t>
-      </w:r>
-      <w:r>
-        <w:t xml:space="preserve"> </w:t>
-      </w:r>
-      <w:r>
-        <w:t xml:space="preserve">administrators. Corrections are made by voiding and sending a new document.</w:t>
-      </w:r>
-    </w:p>
-    <w:p>
-      <w:pPr>
-        <w:pStyle w:val="Compact"/>
-        <w:numPr>
-          <w:ilvl w:val="0"/>
-          <w:numId w:val="1004"/>
-        </w:numPr>
-      </w:pPr>
-      <w:r>
-        <w:rPr>
-          <w:b/>
-          <w:bCs/>
-        </w:rPr>
-        <w:t xml:space="preserve">Consent and privacy.</w:t>
-      </w:r>
-      <w:r>
-        <w:t xml:space="preserve"> </w:t>
-      </w:r>
-      <w:r>
-        <w:t xml:space="preserve">Signers consent to electronic signing, and the page states what is</w:t>
-      </w:r>
-      <w:r>
-        <w:t xml:space="preserve"> </w:t>
-      </w:r>
-      <w:r>
-        <w:t xml:space="preserve">collected (name, email, phone, network address, device). Personal data in documents is covered by</w:t>
-      </w:r>
-      <w:r>
-        <w:t xml:space="preserve"> </w:t>
-      </w:r>
-      <w:r>
-        <w:t xml:space="preserve">the workspace’s own privacy obligations; legal review of the Personal Data Protection Act position</w:t>
-      </w:r>
-      <w:r>
-        <w:t xml:space="preserve"> </w:t>
-      </w:r>
-      <w:r>
-        <w:t xml:space="preserve">is part of Phase 0.</w:t>
-      </w:r>
-    </w:p>
-    <w:p>
-      <w:pPr>
-        <w:pStyle w:val="Compact"/>
-        <w:numPr>
-          <w:ilvl w:val="0"/>
-          <w:numId w:val="1004"/>
-        </w:numPr>
-      </w:pPr>
-      <w:r>
-        <w:rPr>
-          <w:b/>
-          <w:bCs/>
-        </w:rPr>
-        <w:t xml:space="preserve">Retention versus deletion.</w:t>
-      </w:r>
-      <w:r>
-        <w:t xml:space="preserve"> </w:t>
-      </w:r>
-      <w:r>
-        <w:t xml:space="preserve">Halo deletes a workspace’s data after a 30-day owner request.</w:t>
-      </w:r>
-      <w:r>
-        <w:t xml:space="preserve"> </w:t>
-      </w:r>
-      <w:r>
-        <w:t xml:space="preserve">Signed contracts may need to outlive that. Proposal: the owner’s</w:t>
-      </w:r>
-      <w:r>
-        <w:t xml:space="preserve"> </w:t>
-      </w:r>
-      <w:r>
-        <w:rPr>
-          <w:b/>
-          <w:bCs/>
-        </w:rPr>
-        <w:t xml:space="preserve">export</w:t>
-      </w:r>
-      <w:r>
-        <w:t xml:space="preserve"> </w:t>
-      </w:r>
-      <w:r>
-        <w:t xml:space="preserve">always includes signed</w:t>
-      </w:r>
-      <w:r>
-        <w:t xml:space="preserve"> </w:t>
-      </w:r>
-      <w:r>
-        <w:t xml:space="preserve">files; a</w:t>
-      </w:r>
-      <w:r>
-        <w:t xml:space="preserve"> </w:t>
-      </w:r>
-      <w:r>
-        <w:rPr>
-          <w:b/>
-          <w:bCs/>
-        </w:rPr>
-        <w:t xml:space="preserve">retained copy</w:t>
-      </w:r>
-      <w:r>
-        <w:t xml:space="preserve"> </w:t>
-      </w:r>
-      <w:r>
-        <w:t xml:space="preserve">of sealed documents and certificates is kept by the platform for the</w:t>
-      </w:r>
-      <w:r>
-        <w:t xml:space="preserve"> </w:t>
-      </w:r>
-      <w:r>
-        <w:t xml:space="preserve">retention period, held without the workspace’s other data. Needs your decision and legal advice.</w:t>
-      </w:r>
-    </w:p>
-    <w:p>
-      <w:pPr>
-        <w:pStyle w:val="Compact"/>
-        <w:numPr>
-          <w:ilvl w:val="0"/>
-          <w:numId w:val="1004"/>
-        </w:numPr>
-      </w:pPr>
-      <w:r>
-        <w:rPr>
-          <w:b/>
-          <w:bCs/>
-        </w:rPr>
-        <w:t xml:space="preserve">No branding of the supplier on customer pages.</w:t>
-      </w:r>
-      <w:r>
-        <w:t xml:space="preserve"> </w:t>
-      </w:r>
-      <w:r>
-        <w:t xml:space="preserve">Signer pages and emails use the workspace’s</w:t>
-      </w:r>
-      <w:r>
-        <w:t xml:space="preserve"> </w:t>
-      </w:r>
-      <w:r>
-        <w:t xml:space="preserve">name and logo, and neutral wording for Halo.</w:t>
-      </w:r>
-    </w:p>
-    <w:bookmarkEnd w:id="22"/>
-    <w:bookmarkStart w:id="23" w:name="permissions"/>
-    <w:p>
-      <w:pPr>
-        <w:pStyle w:val="Heading1"/>
-      </w:pPr>
-      <w:r>
-        <w:t xml:space="preserve">7. Permissions</w:t>
+        <w:pStyle w:val="Heading2"/>
+      </w:pPr>
+      <w:r>
+        <w:t xml:space="preserve">3.9 The signing list and order</w:t>
       </w:r>
     </w:p>
     <w:tbl>
@@ -4496,6 +4278,1602 @@
               <w:pStyle w:val="Compact"/>
             </w:pPr>
             <w:r>
+              <w:t xml:space="preserve">Id</w:t>
+            </w:r>
+          </w:p>
+        </w:tc>
+        <w:tc>
+          <w:tcPr/>
+          <w:p>
+            <w:pPr>
+              <w:pStyle w:val="Compact"/>
+            </w:pPr>
+            <w:r>
+              <w:t xml:space="preserve">Requirement</w:t>
+            </w:r>
+          </w:p>
+        </w:tc>
+        <w:tc>
+          <w:tcPr/>
+          <w:p>
+            <w:pPr>
+              <w:pStyle w:val="Compact"/>
+            </w:pPr>
+            <w:r>
+              <w:t xml:space="preserve">Pri</w:t>
+            </w:r>
+          </w:p>
+        </w:tc>
+      </w:tr>
+      <w:tr>
+        <w:tc>
+          <w:tcPr/>
+          <w:p>
+            <w:pPr>
+              <w:pStyle w:val="Compact"/>
+            </w:pPr>
+            <w:r>
+              <w:t xml:space="preserve">F-66</w:t>
+            </w:r>
+          </w:p>
+        </w:tc>
+        <w:tc>
+          <w:tcPr/>
+          <w:p>
+            <w:pPr>
+              <w:pStyle w:val="Compact"/>
+            </w:pPr>
+            <w:r>
+              <w:rPr>
+                <w:b/>
+                <w:bCs/>
+              </w:rPr>
+              <w:t xml:space="preserve">Signing list</w:t>
+            </w:r>
+            <w:r>
+              <w:t xml:space="preserve"> </w:t>
+            </w:r>
+            <w:r>
+              <w:t xml:space="preserve">on every document: one row per signer with</w:t>
+            </w:r>
+            <w:r>
+              <w:t xml:space="preserve"> </w:t>
+            </w:r>
+            <w:r>
+              <w:rPr>
+                <w:b/>
+                <w:bCs/>
+              </w:rPr>
+              <w:t xml:space="preserve">full name</w:t>
+            </w:r>
+            <w:r>
+              <w:t xml:space="preserve"> </w:t>
+            </w:r>
+            <w:r>
+              <w:t xml:space="preserve">and</w:t>
+            </w:r>
+            <w:r>
+              <w:t xml:space="preserve"> </w:t>
+            </w:r>
+            <w:r>
+              <w:rPr>
+                <w:b/>
+                <w:bCs/>
+              </w:rPr>
+              <w:t xml:space="preserve">email</w:t>
+            </w:r>
+            <w:r>
+              <w:t xml:space="preserve"> </w:t>
+            </w:r>
+            <w:r>
+              <w:t xml:space="preserve">(both required), phone (required only when WhatsApp is chosen), role, and an</w:t>
+            </w:r>
+            <w:r>
+              <w:t xml:space="preserve"> </w:t>
+            </w:r>
+            <w:r>
+              <w:rPr>
+                <w:b/>
+                <w:bCs/>
+              </w:rPr>
+              <w:t xml:space="preserve">order number</w:t>
+            </w:r>
+            <w:r>
+              <w:t xml:space="preserve">. Rows can be added, removed and dragged into a new order before sending; picking a Halo contact fills a row in one click.</w:t>
+            </w:r>
+          </w:p>
+        </w:tc>
+        <w:tc>
+          <w:tcPr/>
+          <w:p>
+            <w:pPr>
+              <w:pStyle w:val="Compact"/>
+            </w:pPr>
+            <w:r>
+              <w:t xml:space="preserve">P1</w:t>
+            </w:r>
+          </w:p>
+        </w:tc>
+      </w:tr>
+      <w:tr>
+        <w:tc>
+          <w:tcPr/>
+          <w:p>
+            <w:pPr>
+              <w:pStyle w:val="Compact"/>
+            </w:pPr>
+            <w:r>
+              <w:t xml:space="preserve">F-67</w:t>
+            </w:r>
+          </w:p>
+        </w:tc>
+        <w:tc>
+          <w:tcPr/>
+          <w:p>
+            <w:pPr>
+              <w:pStyle w:val="Compact"/>
+            </w:pPr>
+            <w:r>
+              <w:rPr>
+                <w:b/>
+                <w:bCs/>
+              </w:rPr>
+              <w:t xml:space="preserve">Sign in order</w:t>
+            </w:r>
+            <w:r>
+              <w:t xml:space="preserve"> </w:t>
+            </w:r>
+            <w:r>
+              <w:t xml:space="preserve">switch, chosen when the document is created.</w:t>
+            </w:r>
+            <w:r>
+              <w:t xml:space="preserve"> </w:t>
+            </w:r>
+            <w:r>
+              <w:rPr>
+                <w:b/>
+                <w:bCs/>
+              </w:rPr>
+              <w:t xml:space="preserve">On:</w:t>
+            </w:r>
+            <w:r>
+              <w:t xml:space="preserve"> </w:t>
+            </w:r>
+            <w:r>
+              <w:t xml:space="preserve">the document follows the list order; only the first step is invited; each next step is invited automatically when the one before is complete; before their turn a signer’s link shows</w:t>
+            </w:r>
+            <w:r>
+              <w:t xml:space="preserve"> </w:t>
+            </w:r>
+            <w:r>
+              <w:t xml:space="preserve">“Waiting for {name} to sign first”</w:t>
+            </w:r>
+            <w:r>
+              <w:t xml:space="preserve"> </w:t>
+            </w:r>
+            <w:r>
+              <w:t xml:space="preserve">and no document content.</w:t>
+            </w:r>
+            <w:r>
+              <w:t xml:space="preserve"> </w:t>
+            </w:r>
+            <w:r>
+              <w:rPr>
+                <w:b/>
+                <w:bCs/>
+              </w:rPr>
+              <w:t xml:space="preserve">Off:</w:t>
+            </w:r>
+            <w:r>
+              <w:t xml:space="preserve"> </w:t>
+            </w:r>
+            <w:r>
+              <w:t xml:space="preserve">everyone is invited at once, anyone can sign first, and the order numbers are ignored.</w:t>
+            </w:r>
+          </w:p>
+        </w:tc>
+        <w:tc>
+          <w:tcPr/>
+          <w:p>
+            <w:pPr>
+              <w:pStyle w:val="Compact"/>
+            </w:pPr>
+            <w:r>
+              <w:t xml:space="preserve">P1</w:t>
+            </w:r>
+          </w:p>
+        </w:tc>
+      </w:tr>
+      <w:tr>
+        <w:tc>
+          <w:tcPr/>
+          <w:p>
+            <w:pPr>
+              <w:pStyle w:val="Compact"/>
+            </w:pPr>
+            <w:r>
+              <w:t xml:space="preserve">F-68</w:t>
+            </w:r>
+          </w:p>
+        </w:tc>
+        <w:tc>
+          <w:tcPr/>
+          <w:p>
+            <w:pPr>
+              <w:pStyle w:val="Compact"/>
+            </w:pPr>
+            <w:r>
+              <w:t xml:space="preserve">Signers who share an order number form one</w:t>
+            </w:r>
+            <w:r>
+              <w:t xml:space="preserve"> </w:t>
+            </w:r>
+            <w:r>
+              <w:rPr>
+                <w:b/>
+                <w:bCs/>
+              </w:rPr>
+              <w:t xml:space="preserve">step</w:t>
+            </w:r>
+            <w:r>
+              <w:t xml:space="preserve"> </w:t>
+            </w:r>
+            <w:r>
+              <w:t xml:space="preserve">and sign in parallel; the next step starts when every signer in the step has finished.</w:t>
+            </w:r>
+          </w:p>
+        </w:tc>
+        <w:tc>
+          <w:tcPr/>
+          <w:p>
+            <w:pPr>
+              <w:pStyle w:val="Compact"/>
+            </w:pPr>
+            <w:r>
+              <w:t xml:space="preserve">P1</w:t>
+            </w:r>
+          </w:p>
+        </w:tc>
+      </w:tr>
+      <w:tr>
+        <w:tc>
+          <w:tcPr/>
+          <w:p>
+            <w:pPr>
+              <w:pStyle w:val="Compact"/>
+            </w:pPr>
+            <w:r>
+              <w:t xml:space="preserve">F-69</w:t>
+            </w:r>
+          </w:p>
+        </w:tc>
+        <w:tc>
+          <w:tcPr/>
+          <w:p>
+            <w:pPr>
+              <w:pStyle w:val="Compact"/>
+            </w:pPr>
+            <w:r>
+              <w:t xml:space="preserve">While order is on: reminders go only to the current step’s signers; a decline stops the chain and tells the sender; expiry applies to the whole document; a countersigner inside Halo sees the document under</w:t>
+            </w:r>
+            <w:r>
+              <w:t xml:space="preserve"> </w:t>
+            </w:r>
+            <w:r>
+              <w:t xml:space="preserve">“Awaiting my signature”</w:t>
+            </w:r>
+            <w:r>
+              <w:t xml:space="preserve"> </w:t>
+            </w:r>
+            <w:r>
+              <w:t xml:space="preserve">only when their step begins.</w:t>
+            </w:r>
+          </w:p>
+        </w:tc>
+        <w:tc>
+          <w:tcPr/>
+          <w:p>
+            <w:pPr>
+              <w:pStyle w:val="Compact"/>
+            </w:pPr>
+            <w:r>
+              <w:t xml:space="preserve">P1</w:t>
+            </w:r>
+          </w:p>
+        </w:tc>
+      </w:tr>
+      <w:tr>
+        <w:tc>
+          <w:tcPr/>
+          <w:p>
+            <w:pPr>
+              <w:pStyle w:val="Compact"/>
+            </w:pPr>
+            <w:r>
+              <w:t xml:space="preserve">F-70</w:t>
+            </w:r>
+          </w:p>
+        </w:tc>
+        <w:tc>
+          <w:tcPr/>
+          <w:p>
+            <w:pPr>
+              <w:pStyle w:val="Compact"/>
+            </w:pPr>
+            <w:r>
+              <w:t xml:space="preserve">After sending: a signer not yet invited can be renamed, re-addressed or moved to a later position; the current or a finished signer can only be replaced with</w:t>
+            </w:r>
+            <w:r>
+              <w:t xml:space="preserve"> </w:t>
+            </w:r>
+            <w:r>
+              <w:t xml:space="preserve">“change recipient”</w:t>
+            </w:r>
+            <w:r>
+              <w:t xml:space="preserve"> </w:t>
+            </w:r>
+            <w:r>
+              <w:t xml:space="preserve">(new link, same position). The order switch itself cannot be flipped after sending: void and send again.</w:t>
+            </w:r>
+          </w:p>
+        </w:tc>
+        <w:tc>
+          <w:tcPr/>
+          <w:p>
+            <w:pPr>
+              <w:pStyle w:val="Compact"/>
+            </w:pPr>
+            <w:r>
+              <w:t xml:space="preserve">P1</w:t>
+            </w:r>
+          </w:p>
+        </w:tc>
+      </w:tr>
+      <w:tr>
+        <w:tc>
+          <w:tcPr/>
+          <w:p>
+            <w:pPr>
+              <w:pStyle w:val="Compact"/>
+            </w:pPr>
+            <w:r>
+              <w:t xml:space="preserve">F-71</w:t>
+            </w:r>
+          </w:p>
+        </w:tc>
+        <w:tc>
+          <w:tcPr/>
+          <w:p>
+            <w:pPr>
+              <w:pStyle w:val="Compact"/>
+            </w:pPr>
+            <w:r>
+              <w:t xml:space="preserve">The list and the order are recorded in the sealed record: the completion certificate lists signers in signing order with their times, and the audit trail records each invitation as</w:t>
+            </w:r>
+            <w:r>
+              <w:t xml:space="preserve"> </w:t>
+            </w:r>
+            <w:r>
+              <w:t xml:space="preserve">“invited because {name} finished”</w:t>
+            </w:r>
+            <w:r>
+              <w:t xml:space="preserve">.</w:t>
+            </w:r>
+          </w:p>
+        </w:tc>
+        <w:tc>
+          <w:tcPr/>
+          <w:p>
+            <w:pPr>
+              <w:pStyle w:val="Compact"/>
+            </w:pPr>
+            <w:r>
+              <w:t xml:space="preserve">P1</w:t>
+            </w:r>
+          </w:p>
+        </w:tc>
+      </w:tr>
+      <w:tr>
+        <w:tc>
+          <w:tcPr/>
+          <w:p>
+            <w:pPr>
+              <w:pStyle w:val="Compact"/>
+            </w:pPr>
+            <w:r>
+              <w:t xml:space="preserve">F-72</w:t>
+            </w:r>
+          </w:p>
+        </w:tc>
+        <w:tc>
+          <w:tcPr/>
+          <w:p>
+            <w:pPr>
+              <w:pStyle w:val="Compact"/>
+            </w:pPr>
+            <w:r>
+              <w:t xml:space="preserve">A template stores its roles and default order and switch setting; the wizard prefills them and the sender may change them for this document. A role can be an internal Halo user (countersigner).</w:t>
+            </w:r>
+          </w:p>
+        </w:tc>
+        <w:tc>
+          <w:tcPr/>
+          <w:p>
+            <w:pPr>
+              <w:pStyle w:val="Compact"/>
+            </w:pPr>
+            <w:r>
+              <w:t xml:space="preserve">P1</w:t>
+            </w:r>
+          </w:p>
+        </w:tc>
+      </w:tr>
+    </w:tbl>
+    <w:bookmarkEnd w:id="19"/>
+    <w:bookmarkStart w:id="20" w:name="any-document-upload-word-prepare"/>
+    <w:p>
+      <w:pPr>
+        <w:pStyle w:val="Heading2"/>
+      </w:pPr>
+      <w:r>
+        <w:t xml:space="preserve">3.10 Any document: upload, Word, prepare</w:t>
+      </w:r>
+    </w:p>
+    <w:tbl>
+      <w:tblPr>
+        <w:tblStyle w:val="Table"/>
+        <w:tblW w:type="pct" w:w="5000"/>
+        <w:tblLayout w:type="fixed"/>
+        <w:tblLook w:firstRow="1" w:lastRow="0" w:firstColumn="0" w:lastColumn="0" w:noHBand="0" w:noVBand="0" w:val="0020"/>
+      </w:tblPr>
+      <w:tblGrid>
+        <w:gridCol w:w="2640"/>
+        <w:gridCol w:w="2640"/>
+        <w:gridCol w:w="2640"/>
+      </w:tblGrid>
+      <w:tr>
+        <w:trPr>
+          <w:tblHeader w:val="on"/>
+        </w:trPr>
+        <w:tc>
+          <w:tcPr/>
+          <w:p>
+            <w:pPr>
+              <w:pStyle w:val="Compact"/>
+            </w:pPr>
+            <w:r>
+              <w:t xml:space="preserve">Id</w:t>
+            </w:r>
+          </w:p>
+        </w:tc>
+        <w:tc>
+          <w:tcPr/>
+          <w:p>
+            <w:pPr>
+              <w:pStyle w:val="Compact"/>
+            </w:pPr>
+            <w:r>
+              <w:t xml:space="preserve">Requirement</w:t>
+            </w:r>
+          </w:p>
+        </w:tc>
+        <w:tc>
+          <w:tcPr/>
+          <w:p>
+            <w:pPr>
+              <w:pStyle w:val="Compact"/>
+            </w:pPr>
+            <w:r>
+              <w:t xml:space="preserve">Pri</w:t>
+            </w:r>
+          </w:p>
+        </w:tc>
+      </w:tr>
+      <w:tr>
+        <w:tc>
+          <w:tcPr/>
+          <w:p>
+            <w:pPr>
+              <w:pStyle w:val="Compact"/>
+            </w:pPr>
+            <w:r>
+              <w:t xml:space="preserve">F-73</w:t>
+            </w:r>
+          </w:p>
+        </w:tc>
+        <w:tc>
+          <w:tcPr/>
+          <w:p>
+            <w:pPr>
+              <w:pStyle w:val="Compact"/>
+            </w:pPr>
+            <w:r>
+              <w:rPr>
+                <w:b/>
+                <w:bCs/>
+              </w:rPr>
+              <w:t xml:space="preserve">Upload and prepare any document.</w:t>
+            </w:r>
+            <w:r>
+              <w:t xml:space="preserve"> </w:t>
+            </w:r>
+            <w:r>
+              <w:t xml:space="preserve">From Doc Sign, a contact or a ticket, upload a PDF, Word file or image, place fields with the full editor and send, with no template.</w:t>
+            </w:r>
+            <w:r>
+              <w:t xml:space="preserve"> </w:t>
+            </w:r>
+            <w:r>
+              <w:t xml:space="preserve">“Save as template”</w:t>
+            </w:r>
+            <w:r>
+              <w:t xml:space="preserve"> </w:t>
+            </w:r>
+            <w:r>
+              <w:t xml:space="preserve">is one click at any point.</w:t>
+            </w:r>
+          </w:p>
+        </w:tc>
+        <w:tc>
+          <w:tcPr/>
+          <w:p>
+            <w:pPr>
+              <w:pStyle w:val="Compact"/>
+            </w:pPr>
+            <w:r>
+              <w:t xml:space="preserve">P1</w:t>
+            </w:r>
+          </w:p>
+        </w:tc>
+      </w:tr>
+      <w:tr>
+        <w:tc>
+          <w:tcPr/>
+          <w:p>
+            <w:pPr>
+              <w:pStyle w:val="Compact"/>
+            </w:pPr>
+            <w:r>
+              <w:t xml:space="preserve">F-74</w:t>
+            </w:r>
+          </w:p>
+        </w:tc>
+        <w:tc>
+          <w:tcPr/>
+          <w:p>
+            <w:pPr>
+              <w:pStyle w:val="Compact"/>
+            </w:pPr>
+            <w:r>
+              <w:rPr>
+                <w:b/>
+                <w:bCs/>
+              </w:rPr>
+              <w:t xml:space="preserve">Word files are converted to PDF</w:t>
+            </w:r>
+            <w:r>
+              <w:t xml:space="preserve"> </w:t>
+            </w:r>
+            <w:r>
+              <w:t xml:space="preserve">before preparing. The editor shows the converted pages with the notice</w:t>
+            </w:r>
+            <w:r>
+              <w:t xml:space="preserve"> </w:t>
+            </w:r>
+            <w:r>
+              <w:t xml:space="preserve">“This is exactly what will be signed”</w:t>
+            </w:r>
+            <w:r>
+              <w:t xml:space="preserve">; the original Word file is kept with the document. If conversion fails, the message tells the sender to save as PDF and upload that.</w:t>
+            </w:r>
+          </w:p>
+        </w:tc>
+        <w:tc>
+          <w:tcPr/>
+          <w:p>
+            <w:pPr>
+              <w:pStyle w:val="Compact"/>
+            </w:pPr>
+            <w:r>
+              <w:t xml:space="preserve">P1</w:t>
+            </w:r>
+          </w:p>
+        </w:tc>
+      </w:tr>
+      <w:tr>
+        <w:tc>
+          <w:tcPr/>
+          <w:p>
+            <w:pPr>
+              <w:pStyle w:val="Compact"/>
+            </w:pPr>
+            <w:r>
+              <w:t xml:space="preserve">F-75</w:t>
+            </w:r>
+          </w:p>
+        </w:tc>
+        <w:tc>
+          <w:tcPr/>
+          <w:p>
+            <w:pPr>
+              <w:pStyle w:val="Compact"/>
+            </w:pPr>
+            <w:r>
+              <w:t xml:space="preserve">Images become one-page PDFs (a photographed form, a scan).</w:t>
+            </w:r>
+          </w:p>
+        </w:tc>
+        <w:tc>
+          <w:tcPr/>
+          <w:p>
+            <w:pPr>
+              <w:pStyle w:val="Compact"/>
+            </w:pPr>
+            <w:r>
+              <w:t xml:space="preserve">P1</w:t>
+            </w:r>
+          </w:p>
+        </w:tc>
+      </w:tr>
+      <w:tr>
+        <w:tc>
+          <w:tcPr/>
+          <w:p>
+            <w:pPr>
+              <w:pStyle w:val="Compact"/>
+            </w:pPr>
+            <w:r>
+              <w:t xml:space="preserve">F-76</w:t>
+            </w:r>
+          </w:p>
+        </w:tc>
+        <w:tc>
+          <w:tcPr/>
+          <w:p>
+            <w:pPr>
+              <w:pStyle w:val="Compact"/>
+            </w:pPr>
+            <w:r>
+              <w:t xml:space="preserve">Insert signing locations, text, dates, numbers and the other field types in F-03 anywhere on any page of any uploaded document.</w:t>
+            </w:r>
+          </w:p>
+        </w:tc>
+        <w:tc>
+          <w:tcPr/>
+          <w:p>
+            <w:pPr>
+              <w:pStyle w:val="Compact"/>
+            </w:pPr>
+            <w:r>
+              <w:t xml:space="preserve">P1</w:t>
+            </w:r>
+          </w:p>
+        </w:tc>
+      </w:tr>
+      <w:tr>
+        <w:tc>
+          <w:tcPr/>
+          <w:p>
+            <w:pPr>
+              <w:pStyle w:val="Compact"/>
+            </w:pPr>
+            <w:r>
+              <w:t xml:space="preserve">F-77</w:t>
+            </w:r>
+          </w:p>
+        </w:tc>
+        <w:tc>
+          <w:tcPr/>
+          <w:p>
+            <w:pPr>
+              <w:pStyle w:val="Compact"/>
+            </w:pPr>
+            <w:r>
+              <w:rPr>
+                <w:b/>
+                <w:bCs/>
+              </w:rPr>
+              <w:t xml:space="preserve">Replace file</w:t>
+            </w:r>
+            <w:r>
+              <w:t xml:space="preserve"> </w:t>
+            </w:r>
+            <w:r>
+              <w:t xml:space="preserve">on a draft keeps field positions where page count and size match and flags fields that no longer fit.</w:t>
+            </w:r>
+          </w:p>
+        </w:tc>
+        <w:tc>
+          <w:tcPr/>
+          <w:p>
+            <w:pPr>
+              <w:pStyle w:val="Compact"/>
+            </w:pPr>
+            <w:r>
+              <w:t xml:space="preserve">P2</w:t>
+            </w:r>
+          </w:p>
+        </w:tc>
+      </w:tr>
+    </w:tbl>
+    <w:bookmarkEnd w:id="20"/>
+    <w:bookmarkStart w:id="21" w:name="categories-and-add-ons"/>
+    <w:p>
+      <w:pPr>
+        <w:pStyle w:val="Heading2"/>
+      </w:pPr>
+      <w:r>
+        <w:t xml:space="preserve">3.11 Categories and add-ons</w:t>
+      </w:r>
+    </w:p>
+    <w:tbl>
+      <w:tblPr>
+        <w:tblStyle w:val="Table"/>
+        <w:tblW w:type="pct" w:w="5000"/>
+        <w:tblLayout w:type="fixed"/>
+        <w:tblLook w:firstRow="1" w:lastRow="0" w:firstColumn="0" w:lastColumn="0" w:noHBand="0" w:noVBand="0" w:val="0020"/>
+      </w:tblPr>
+      <w:tblGrid>
+        <w:gridCol w:w="2640"/>
+        <w:gridCol w:w="2640"/>
+        <w:gridCol w:w="2640"/>
+      </w:tblGrid>
+      <w:tr>
+        <w:trPr>
+          <w:tblHeader w:val="on"/>
+        </w:trPr>
+        <w:tc>
+          <w:tcPr/>
+          <w:p>
+            <w:pPr>
+              <w:pStyle w:val="Compact"/>
+            </w:pPr>
+            <w:r>
+              <w:t xml:space="preserve">Id</w:t>
+            </w:r>
+          </w:p>
+        </w:tc>
+        <w:tc>
+          <w:tcPr/>
+          <w:p>
+            <w:pPr>
+              <w:pStyle w:val="Compact"/>
+            </w:pPr>
+            <w:r>
+              <w:t xml:space="preserve">Requirement</w:t>
+            </w:r>
+          </w:p>
+        </w:tc>
+        <w:tc>
+          <w:tcPr/>
+          <w:p>
+            <w:pPr>
+              <w:pStyle w:val="Compact"/>
+            </w:pPr>
+            <w:r>
+              <w:t xml:space="preserve">Pri</w:t>
+            </w:r>
+          </w:p>
+        </w:tc>
+      </w:tr>
+      <w:tr>
+        <w:tc>
+          <w:tcPr/>
+          <w:p>
+            <w:pPr>
+              <w:pStyle w:val="Compact"/>
+            </w:pPr>
+            <w:r>
+              <w:t xml:space="preserve">F-78</w:t>
+            </w:r>
+          </w:p>
+        </w:tc>
+        <w:tc>
+          <w:tcPr/>
+          <w:p>
+            <w:pPr>
+              <w:pStyle w:val="Compact"/>
+            </w:pPr>
+            <w:r>
+              <w:rPr>
+                <w:b/>
+                <w:bCs/>
+              </w:rPr>
+              <w:t xml:space="preserve">Categories.</w:t>
+            </w:r>
+            <w:r>
+              <w:t xml:space="preserve"> </w:t>
+            </w:r>
+            <w:r>
+              <w:t xml:space="preserve">Every template and document has a category (for example Merchant agreements, Employment, Vendors, General). Workspaces create, rename and archive their own. Lists filter by category. A category carries defaults that override the workspace defaults: expiry, reminders, code required, sign-in-order on or off, consent wording, retention.</w:t>
+            </w:r>
+          </w:p>
+        </w:tc>
+        <w:tc>
+          <w:tcPr/>
+          <w:p>
+            <w:pPr>
+              <w:pStyle w:val="Compact"/>
+            </w:pPr>
+            <w:r>
+              <w:t xml:space="preserve">P1</w:t>
+            </w:r>
+          </w:p>
+        </w:tc>
+      </w:tr>
+      <w:tr>
+        <w:tc>
+          <w:tcPr/>
+          <w:p>
+            <w:pPr>
+              <w:pStyle w:val="Compact"/>
+            </w:pPr>
+            <w:r>
+              <w:t xml:space="preserve">F-79</w:t>
+            </w:r>
+          </w:p>
+        </w:tc>
+        <w:tc>
+          <w:tcPr/>
+          <w:p>
+            <w:pPr>
+              <w:pStyle w:val="Compact"/>
+            </w:pPr>
+            <w:r>
+              <w:rPr>
+                <w:b/>
+                <w:bCs/>
+              </w:rPr>
+              <w:t xml:space="preserve">Add-ons</w:t>
+            </w:r>
+            <w:r>
+              <w:t xml:space="preserve"> </w:t>
+            </w:r>
+            <w:r>
+              <w:t xml:space="preserve">are ready-made packs for a business process. Each can contain a category, templates, contact fields, wording and, later, an automation recipe and a registration form. The first add-on is</w:t>
+            </w:r>
+            <w:r>
+              <w:t xml:space="preserve"> </w:t>
+            </w:r>
+            <w:r>
+              <w:rPr>
+                <w:b/>
+                <w:bCs/>
+              </w:rPr>
+              <w:t xml:space="preserve">Merchant Registration</w:t>
+            </w:r>
+            <w:r>
+              <w:t xml:space="preserve">.</w:t>
+            </w:r>
+          </w:p>
+        </w:tc>
+        <w:tc>
+          <w:tcPr/>
+          <w:p>
+            <w:pPr>
+              <w:pStyle w:val="Compact"/>
+            </w:pPr>
+            <w:r>
+              <w:t xml:space="preserve">P1</w:t>
+            </w:r>
+          </w:p>
+        </w:tc>
+      </w:tr>
+      <w:tr>
+        <w:tc>
+          <w:tcPr/>
+          <w:p>
+            <w:pPr>
+              <w:pStyle w:val="Compact"/>
+            </w:pPr>
+            <w:r>
+              <w:t xml:space="preserve">F-80</w:t>
+            </w:r>
+          </w:p>
+        </w:tc>
+        <w:tc>
+          <w:tcPr/>
+          <w:p>
+            <w:pPr>
+              <w:pStyle w:val="Compact"/>
+            </w:pPr>
+            <w:r>
+              <w:rPr>
+                <w:b/>
+                <w:bCs/>
+              </w:rPr>
+              <w:t xml:space="preserve">Operator control.</w:t>
+            </w:r>
+            <w:r>
+              <w:t xml:space="preserve"> </w:t>
+            </w:r>
+            <w:r>
+              <w:t xml:space="preserve">Which add-ons a workspace may use is switched in the Platform console. A workspace Owner or Admin installs an available add-on from Settings &gt; Doc Sign &gt; Add-ons. Installing again never overwrites what the workspace has changed.</w:t>
+            </w:r>
+          </w:p>
+        </w:tc>
+        <w:tc>
+          <w:tcPr/>
+          <w:p>
+            <w:pPr>
+              <w:pStyle w:val="Compact"/>
+            </w:pPr>
+            <w:r>
+              <w:t xml:space="preserve">P1</w:t>
+            </w:r>
+          </w:p>
+        </w:tc>
+      </w:tr>
+      <w:tr>
+        <w:tc>
+          <w:tcPr/>
+          <w:p>
+            <w:pPr>
+              <w:pStyle w:val="Compact"/>
+            </w:pPr>
+            <w:r>
+              <w:t xml:space="preserve">F-81</w:t>
+            </w:r>
+          </w:p>
+        </w:tc>
+        <w:tc>
+          <w:tcPr/>
+          <w:p>
+            <w:pPr>
+              <w:pStyle w:val="Compact"/>
+            </w:pPr>
+            <w:r>
+              <w:rPr>
+                <w:b/>
+                <w:bCs/>
+              </w:rPr>
+              <w:t xml:space="preserve">Add-on updates.</w:t>
+            </w:r>
+            <w:r>
+              <w:t xml:space="preserve"> </w:t>
+            </w:r>
+            <w:r>
+              <w:t xml:space="preserve">A new version shows as</w:t>
+            </w:r>
+            <w:r>
+              <w:t xml:space="preserve"> </w:t>
+            </w:r>
+            <w:r>
+              <w:t xml:space="preserve">“Update available”</w:t>
+            </w:r>
+            <w:r>
+              <w:t xml:space="preserve"> </w:t>
+            </w:r>
+            <w:r>
+              <w:t xml:space="preserve">with a list of changes; applying it creates new template versions and never alters sent documents.</w:t>
+            </w:r>
+          </w:p>
+        </w:tc>
+        <w:tc>
+          <w:tcPr/>
+          <w:p>
+            <w:pPr>
+              <w:pStyle w:val="Compact"/>
+            </w:pPr>
+            <w:r>
+              <w:t xml:space="preserve">P2</w:t>
+            </w:r>
+          </w:p>
+        </w:tc>
+      </w:tr>
+    </w:tbl>
+    <w:p>
+      <w:pPr>
+        <w:pStyle w:val="BodyText"/>
+      </w:pPr>
+      <w:r>
+        <w:rPr>
+          <w:b/>
+          <w:bCs/>
+        </w:rPr>
+        <w:t xml:space="preserve">What the Merchant Registration add-on contains:</w:t>
+      </w:r>
+      <w:r>
+        <w:t xml:space="preserve"> </w:t>
+      </w:r>
+      <w:r>
+        <w:t xml:space="preserve">the category</w:t>
+      </w:r>
+      <w:r>
+        <w:t xml:space="preserve"> </w:t>
+      </w:r>
+      <w:r>
+        <w:rPr>
+          <w:i/>
+          <w:iCs/>
+        </w:rPr>
+        <w:t xml:space="preserve">Merchant agreements</w:t>
+      </w:r>
+      <w:r>
+        <w:t xml:space="preserve">; the templates</w:t>
+      </w:r>
+      <w:r>
+        <w:t xml:space="preserve"> </w:t>
+      </w:r>
+      <w:r>
+        <w:rPr>
+          <w:i/>
+          <w:iCs/>
+        </w:rPr>
+        <w:t xml:space="preserve">Merchant Agreement</w:t>
+      </w:r>
+      <w:r>
+        <w:t xml:space="preserve"> </w:t>
+      </w:r>
+      <w:r>
+        <w:t xml:space="preserve">and</w:t>
+      </w:r>
+      <w:r>
+        <w:t xml:space="preserve"> </w:t>
+      </w:r>
+      <w:r>
+        <w:rPr>
+          <w:i/>
+          <w:iCs/>
+        </w:rPr>
+        <w:t xml:space="preserve">Data Processing Terms</w:t>
+      </w:r>
+      <w:r>
+        <w:t xml:space="preserve"> </w:t>
+      </w:r>
+      <w:r>
+        <w:t xml:space="preserve">(Vircle supplies the wording; you provide the</w:t>
+      </w:r>
+      <w:r>
+        <w:t xml:space="preserve"> </w:t>
+      </w:r>
+      <w:r>
+        <w:t xml:space="preserve">files); contact fields for business registration number, authorised person’s IC number, bank name,</w:t>
+      </w:r>
+      <w:r>
+        <w:t xml:space="preserve"> </w:t>
+      </w:r>
+      <w:r>
+        <w:t xml:space="preserve">bank account and outlet address; English and Bahasa Melayu invitation wording. Phase 2 adds the</w:t>
+      </w:r>
+      <w:r>
+        <w:t xml:space="preserve"> </w:t>
+      </w:r>
+      <w:r>
+        <w:t xml:space="preserve">onboarding automation recipe and Phase 3 the public registration form.</w:t>
+      </w:r>
+    </w:p>
+    <w:bookmarkEnd w:id="21"/>
+    <w:bookmarkEnd w:id="22"/>
+    <w:bookmarkStart w:id="23" w:name="out-of-scope-for-now"/>
+    <w:p>
+      <w:pPr>
+        <w:pStyle w:val="Heading1"/>
+      </w:pPr>
+      <w:r>
+        <w:t xml:space="preserve">4. Out of scope for now</w:t>
+      </w:r>
+    </w:p>
+    <w:p>
+      <w:pPr>
+        <w:pStyle w:val="FirstParagraph"/>
+      </w:pPr>
+      <w:r>
+        <w:t xml:space="preserve">In-person (hand-over device) signing, Excel and PowerPoint input (Word is supported), editing the text of the underlying document (change the Word file and upload it again), SMS delivery, face or ID-card</w:t>
+      </w:r>
+      <w:r>
+        <w:t xml:space="preserve"> </w:t>
+      </w:r>
+      <w:r>
+        <w:t xml:space="preserve">verification (eKYC), conditional fields, payment fields, per-tenant custom domains for the signing</w:t>
+      </w:r>
+      <w:r>
+        <w:t xml:space="preserve"> </w:t>
+      </w:r>
+      <w:r>
+        <w:t xml:space="preserve">page, embedding the editor in other sites, and signatures by licensed certificate authority per</w:t>
+      </w:r>
+      <w:r>
+        <w:t xml:space="preserve"> </w:t>
+      </w:r>
+      <w:r>
+        <w:t xml:space="preserve">signer (the P3 certificate is for sealing, not per person).</w:t>
+      </w:r>
+    </w:p>
+    <w:bookmarkEnd w:id="23"/>
+    <w:bookmarkStart w:id="24" w:name="X97b51b3c38bee91f8e24d0090b0ad304f6464fc"/>
+    <w:p>
+      <w:pPr>
+        <w:pStyle w:val="Heading1"/>
+      </w:pPr>
+      <w:r>
+        <w:t xml:space="preserve">5. Merchant registration: the target end-to-end flow</w:t>
+      </w:r>
+    </w:p>
+    <w:p>
+      <w:pPr>
+        <w:pStyle w:val="Compact"/>
+        <w:numPr>
+          <w:ilvl w:val="0"/>
+          <w:numId w:val="1003"/>
+        </w:numPr>
+      </w:pPr>
+      <w:r>
+        <w:t xml:space="preserve">The workspace has the</w:t>
+      </w:r>
+      <w:r>
+        <w:t xml:space="preserve"> </w:t>
+      </w:r>
+      <w:r>
+        <w:rPr>
+          <w:b/>
+          <w:bCs/>
+        </w:rPr>
+        <w:t xml:space="preserve">Merchant Registration add-on</w:t>
+      </w:r>
+      <w:r>
+        <w:t xml:space="preserve"> </w:t>
+      </w:r>
+      <w:r>
+        <w:t xml:space="preserve">installed (section 3.11).</w:t>
+      </w:r>
+    </w:p>
+    <w:p>
+      <w:pPr>
+        <w:pStyle w:val="Compact"/>
+        <w:numPr>
+          <w:ilvl w:val="0"/>
+          <w:numId w:val="1003"/>
+        </w:numPr>
+      </w:pPr>
+      <w:r>
+        <w:t xml:space="preserve">A merchant fills the</w:t>
+      </w:r>
+      <w:r>
+        <w:t xml:space="preserve"> </w:t>
+      </w:r>
+      <w:r>
+        <w:rPr>
+          <w:b/>
+          <w:bCs/>
+        </w:rPr>
+        <w:t xml:space="preserve">registration form</w:t>
+      </w:r>
+      <w:r>
+        <w:t xml:space="preserve"> </w:t>
+      </w:r>
+      <w:r>
+        <w:t xml:space="preserve">(P3) or an agent creates the contact (P1). The</w:t>
+      </w:r>
+      <w:r>
+        <w:t xml:space="preserve"> </w:t>
+      </w:r>
+      <w:r>
+        <w:t xml:space="preserve">contact receives the tag</w:t>
+      </w:r>
+      <w:r>
+        <w:t xml:space="preserve"> </w:t>
+      </w:r>
+      <w:r>
+        <w:t xml:space="preserve">“Merchant applicant”</w:t>
+      </w:r>
+      <w:r>
+        <w:t xml:space="preserve"> </w:t>
+      </w:r>
+      <w:r>
+        <w:t xml:space="preserve">and the business details in custom fields.</w:t>
+      </w:r>
+    </w:p>
+    <w:p>
+      <w:pPr>
+        <w:pStyle w:val="Compact"/>
+        <w:numPr>
+          <w:ilvl w:val="0"/>
+          <w:numId w:val="1003"/>
+        </w:numPr>
+      </w:pPr>
+      <w:r>
+        <w:t xml:space="preserve">The automation</w:t>
+      </w:r>
+      <w:r>
+        <w:t xml:space="preserve"> </w:t>
+      </w:r>
+      <w:r>
+        <w:t xml:space="preserve">“Merchant onboarding”</w:t>
+      </w:r>
+      <w:r>
+        <w:t xml:space="preserve"> </w:t>
+      </w:r>
+      <w:r>
+        <w:t xml:space="preserve">(P2) starts: it sends</w:t>
+      </w:r>
+      <w:r>
+        <w:t xml:space="preserve"> </w:t>
+      </w:r>
+      <w:r>
+        <w:rPr>
+          <w:b/>
+          <w:bCs/>
+        </w:rPr>
+        <w:t xml:space="preserve">Merchant Agreement</w:t>
+      </w:r>
+      <w:r>
+        <w:t xml:space="preserve"> </w:t>
+      </w:r>
+      <w:r>
+        <w:t xml:space="preserve">to the</w:t>
+      </w:r>
+      <w:r>
+        <w:t xml:space="preserve"> </w:t>
+      </w:r>
+      <w:r>
+        <w:t xml:space="preserve">merchant by WhatsApp and email, with the signing list Merchant first, Director second and</w:t>
+      </w:r>
+      <w:r>
+        <w:t xml:space="preserve"> </w:t>
+      </w:r>
+      <w:r>
+        <w:t xml:space="preserve">sign-in-order on. Fields the merchant must complete: signature, company registration</w:t>
+      </w:r>
+      <w:r>
+        <w:t xml:space="preserve"> </w:t>
+      </w:r>
+      <w:r>
+        <w:t xml:space="preserve">number, authorised person’s IC number, bank account, upload of the business registration</w:t>
+      </w:r>
+      <w:r>
+        <w:t xml:space="preserve"> </w:t>
+      </w:r>
+      <w:r>
+        <w:t xml:space="preserve">certificate and an ID copy.</w:t>
+      </w:r>
+    </w:p>
+    <w:p>
+      <w:pPr>
+        <w:pStyle w:val="Compact"/>
+        <w:numPr>
+          <w:ilvl w:val="0"/>
+          <w:numId w:val="1003"/>
+        </w:numPr>
+      </w:pPr>
+      <w:r>
+        <w:t xml:space="preserve">The merchant opens the link on their phone, enters the code, reads, fills, signs.</w:t>
+      </w:r>
+    </w:p>
+    <w:p>
+      <w:pPr>
+        <w:pStyle w:val="Compact"/>
+        <w:numPr>
+          <w:ilvl w:val="0"/>
+          <w:numId w:val="1003"/>
+        </w:numPr>
+      </w:pPr>
+      <w:r>
+        <w:t xml:space="preserve">The countersigner (Vircle Director) is notified in Halo and signs (P2).</w:t>
+      </w:r>
+    </w:p>
+    <w:p>
+      <w:pPr>
+        <w:pStyle w:val="Compact"/>
+        <w:numPr>
+          <w:ilvl w:val="0"/>
+          <w:numId w:val="1003"/>
+        </w:numPr>
+      </w:pPr>
+      <w:r>
+        <w:t xml:space="preserve">The sealed PDF and certificate are saved to the contact. The contact’s stage becomes</w:t>
+      </w:r>
+      <w:r>
+        <w:t xml:space="preserve"> </w:t>
+      </w:r>
+      <w:r>
+        <w:t xml:space="preserve">“Merchant</w:t>
+      </w:r>
+      <w:r>
+        <w:t xml:space="preserve"> </w:t>
+      </w:r>
+      <w:r>
+        <w:t xml:space="preserve">signed”</w:t>
+      </w:r>
+      <w:r>
+        <w:t xml:space="preserve">. A ticket</w:t>
+      </w:r>
+      <w:r>
+        <w:t xml:space="preserve"> </w:t>
+      </w:r>
+      <w:r>
+        <w:t xml:space="preserve">“Merchant KYC review”</w:t>
+      </w:r>
+      <w:r>
+        <w:t xml:space="preserve"> </w:t>
+      </w:r>
+      <w:r>
+        <w:t xml:space="preserve">is opened for the Merchant Operations team with the</w:t>
+      </w:r>
+      <w:r>
+        <w:t xml:space="preserve"> </w:t>
+      </w:r>
+      <w:r>
+        <w:t xml:space="preserve">documents attached.</w:t>
+      </w:r>
+    </w:p>
+    <w:p>
+      <w:pPr>
+        <w:pStyle w:val="Compact"/>
+        <w:numPr>
+          <w:ilvl w:val="0"/>
+          <w:numId w:val="1003"/>
+        </w:numPr>
+      </w:pPr>
+      <w:r>
+        <w:t xml:space="preserve">A webhook tells the merchant backend that the merchant is ready for activation. The merchant is</w:t>
+      </w:r>
+      <w:r>
+        <w:t xml:space="preserve"> </w:t>
+      </w:r>
+      <w:r>
+        <w:t xml:space="preserve">sent a welcome message with their signed copy.</w:t>
+      </w:r>
+    </w:p>
+    <w:p>
+      <w:pPr>
+        <w:pStyle w:val="FirstParagraph"/>
+      </w:pPr>
+      <w:r>
+        <w:t xml:space="preserve">Until P2, steps 2, 4 and 6 are manual: an agent sends from the contact page, countersigns, and</w:t>
+      </w:r>
+      <w:r>
+        <w:t xml:space="preserve"> </w:t>
+      </w:r>
+      <w:r>
+        <w:t xml:space="preserve">reads the completion email.</w:t>
+      </w:r>
+    </w:p>
+    <w:bookmarkEnd w:id="24"/>
+    <w:bookmarkStart w:id="25" w:name="rules-the-module-must-obey"/>
+    <w:p>
+      <w:pPr>
+        <w:pStyle w:val="Heading1"/>
+      </w:pPr>
+      <w:r>
+        <w:t xml:space="preserve">6. Rules the module must obey</w:t>
+      </w:r>
+    </w:p>
+    <w:p>
+      <w:pPr>
+        <w:pStyle w:val="Compact"/>
+        <w:numPr>
+          <w:ilvl w:val="0"/>
+          <w:numId w:val="1004"/>
+        </w:numPr>
+      </w:pPr>
+      <w:r>
+        <w:rPr>
+          <w:b/>
+          <w:bCs/>
+        </w:rPr>
+        <w:t xml:space="preserve">Tenant isolation.</w:t>
+      </w:r>
+      <w:r>
+        <w:t xml:space="preserve"> </w:t>
+      </w:r>
+      <w:r>
+        <w:t xml:space="preserve">Every table carries the workspace id and is protected by row-level</w:t>
+      </w:r>
+      <w:r>
+        <w:t xml:space="preserve"> </w:t>
+      </w:r>
+      <w:r>
+        <w:t xml:space="preserve">security. Signers reach their document only through their private link and never see another</w:t>
+      </w:r>
+      <w:r>
+        <w:t xml:space="preserve"> </w:t>
+      </w:r>
+      <w:r>
+        <w:t xml:space="preserve">document.</w:t>
+      </w:r>
+    </w:p>
+    <w:p>
+      <w:pPr>
+        <w:pStyle w:val="Compact"/>
+        <w:numPr>
+          <w:ilvl w:val="0"/>
+          <w:numId w:val="1004"/>
+        </w:numPr>
+      </w:pPr>
+      <w:r>
+        <w:rPr>
+          <w:b/>
+          <w:bCs/>
+        </w:rPr>
+        <w:t xml:space="preserve">Immutability.</w:t>
+      </w:r>
+      <w:r>
+        <w:t xml:space="preserve"> </w:t>
+      </w:r>
+      <w:r>
+        <w:t xml:space="preserve">A sealed file and its audit trail cannot be changed by anyone, including</w:t>
+      </w:r>
+      <w:r>
+        <w:t xml:space="preserve"> </w:t>
+      </w:r>
+      <w:r>
+        <w:t xml:space="preserve">administrators. Corrections are made by voiding and sending a new document.</w:t>
+      </w:r>
+    </w:p>
+    <w:p>
+      <w:pPr>
+        <w:pStyle w:val="Compact"/>
+        <w:numPr>
+          <w:ilvl w:val="0"/>
+          <w:numId w:val="1004"/>
+        </w:numPr>
+      </w:pPr>
+      <w:r>
+        <w:rPr>
+          <w:b/>
+          <w:bCs/>
+        </w:rPr>
+        <w:t xml:space="preserve">Consent and privacy.</w:t>
+      </w:r>
+      <w:r>
+        <w:t xml:space="preserve"> </w:t>
+      </w:r>
+      <w:r>
+        <w:t xml:space="preserve">Signers consent to electronic signing, and the page states what is</w:t>
+      </w:r>
+      <w:r>
+        <w:t xml:space="preserve"> </w:t>
+      </w:r>
+      <w:r>
+        <w:t xml:space="preserve">collected (name, email, phone, network address, device). Personal data in documents is covered by</w:t>
+      </w:r>
+      <w:r>
+        <w:t xml:space="preserve"> </w:t>
+      </w:r>
+      <w:r>
+        <w:t xml:space="preserve">the workspace’s own privacy obligations; legal review of the Personal Data Protection Act position</w:t>
+      </w:r>
+      <w:r>
+        <w:t xml:space="preserve"> </w:t>
+      </w:r>
+      <w:r>
+        <w:t xml:space="preserve">is part of Phase 0.</w:t>
+      </w:r>
+    </w:p>
+    <w:p>
+      <w:pPr>
+        <w:pStyle w:val="Compact"/>
+        <w:numPr>
+          <w:ilvl w:val="0"/>
+          <w:numId w:val="1004"/>
+        </w:numPr>
+      </w:pPr>
+      <w:r>
+        <w:rPr>
+          <w:b/>
+          <w:bCs/>
+        </w:rPr>
+        <w:t xml:space="preserve">Retention versus deletion.</w:t>
+      </w:r>
+      <w:r>
+        <w:t xml:space="preserve"> </w:t>
+      </w:r>
+      <w:r>
+        <w:t xml:space="preserve">Halo deletes a workspace’s data after a 30-day owner request.</w:t>
+      </w:r>
+      <w:r>
+        <w:t xml:space="preserve"> </w:t>
+      </w:r>
+      <w:r>
+        <w:t xml:space="preserve">Signed contracts may need to outlive that. Proposal: the owner’s</w:t>
+      </w:r>
+      <w:r>
+        <w:t xml:space="preserve"> </w:t>
+      </w:r>
+      <w:r>
+        <w:rPr>
+          <w:b/>
+          <w:bCs/>
+        </w:rPr>
+        <w:t xml:space="preserve">export</w:t>
+      </w:r>
+      <w:r>
+        <w:t xml:space="preserve"> </w:t>
+      </w:r>
+      <w:r>
+        <w:t xml:space="preserve">always includes signed</w:t>
+      </w:r>
+      <w:r>
+        <w:t xml:space="preserve"> </w:t>
+      </w:r>
+      <w:r>
+        <w:t xml:space="preserve">files; a</w:t>
+      </w:r>
+      <w:r>
+        <w:t xml:space="preserve"> </w:t>
+      </w:r>
+      <w:r>
+        <w:rPr>
+          <w:b/>
+          <w:bCs/>
+        </w:rPr>
+        <w:t xml:space="preserve">retained copy</w:t>
+      </w:r>
+      <w:r>
+        <w:t xml:space="preserve"> </w:t>
+      </w:r>
+      <w:r>
+        <w:t xml:space="preserve">of sealed documents and certificates is kept by the platform for the</w:t>
+      </w:r>
+      <w:r>
+        <w:t xml:space="preserve"> </w:t>
+      </w:r>
+      <w:r>
+        <w:t xml:space="preserve">retention period, held without the workspace’s other data. Needs your decision and legal advice.</w:t>
+      </w:r>
+    </w:p>
+    <w:p>
+      <w:pPr>
+        <w:pStyle w:val="Compact"/>
+        <w:numPr>
+          <w:ilvl w:val="0"/>
+          <w:numId w:val="1004"/>
+        </w:numPr>
+      </w:pPr>
+      <w:r>
+        <w:rPr>
+          <w:b/>
+          <w:bCs/>
+        </w:rPr>
+        <w:t xml:space="preserve">No branding of the supplier on customer pages.</w:t>
+      </w:r>
+      <w:r>
+        <w:t xml:space="preserve"> </w:t>
+      </w:r>
+      <w:r>
+        <w:t xml:space="preserve">Signer pages and emails use the workspace’s</w:t>
+      </w:r>
+      <w:r>
+        <w:t xml:space="preserve"> </w:t>
+      </w:r>
+      <w:r>
+        <w:t xml:space="preserve">name and logo, and neutral wording for Halo.</w:t>
+      </w:r>
+    </w:p>
+    <w:bookmarkEnd w:id="25"/>
+    <w:bookmarkStart w:id="26" w:name="permissions"/>
+    <w:p>
+      <w:pPr>
+        <w:pStyle w:val="Heading1"/>
+      </w:pPr>
+      <w:r>
+        <w:t xml:space="preserve">7. Permissions</w:t>
+      </w:r>
+    </w:p>
+    <w:tbl>
+      <w:tblPr>
+        <w:tblStyle w:val="Table"/>
+        <w:tblW w:type="pct" w:w="5000"/>
+        <w:tblLayout w:type="fixed"/>
+        <w:tblLook w:firstRow="1" w:lastRow="0" w:firstColumn="0" w:lastColumn="0" w:noHBand="0" w:noVBand="0" w:val="0020"/>
+      </w:tblPr>
+      <w:tblGrid>
+        <w:gridCol w:w="2640"/>
+        <w:gridCol w:w="2640"/>
+        <w:gridCol w:w="2640"/>
+      </w:tblGrid>
+      <w:tr>
+        <w:trPr>
+          <w:tblHeader w:val="on"/>
+        </w:trPr>
+        <w:tc>
+          <w:tcPr/>
+          <w:p>
+            <w:pPr>
+              <w:pStyle w:val="Compact"/>
+            </w:pPr>
+            <w:r>
               <w:t xml:space="preserve">Permission</w:t>
             </w:r>
           </w:p>
@@ -4804,8 +6182,8 @@
         <w:t xml:space="preserve">Halo’s four roles are Viewer, Agent, Admin and Owner. The read-only stakeholder preset has the menu hidden by default, as with other modules, and an administrator can change any of these defaults per role in Roles.</w:t>
       </w:r>
     </w:p>
-    <w:bookmarkEnd w:id="23"/>
-    <w:bookmarkStart w:id="24" w:name="limits-proposed-all-adjustable"/>
+    <w:bookmarkEnd w:id="26"/>
+    <w:bookmarkStart w:id="27" w:name="limits-proposed-all-adjustable"/>
     <w:p>
       <w:pPr>
         <w:pStyle w:val="Heading1"/>
@@ -4871,7 +6249,7 @@
               <w:pStyle w:val="Compact"/>
             </w:pPr>
             <w:r>
-              <w:t xml:space="preserve">25 MB, 50 pages</w:t>
+              <w:t xml:space="preserve">25 MB, 50 pages; a Word file must convert within 60 seconds</w:t>
             </w:r>
           </w:p>
         </w:tc>
@@ -4895,7 +6273,7 @@
               <w:pStyle w:val="Compact"/>
             </w:pPr>
             <w:r>
-              <w:t xml:space="preserve">6</w:t>
+              <w:t xml:space="preserve">6 (any number of them can share an order step)</w:t>
             </w:r>
           </w:p>
         </w:tc>
@@ -5069,8 +6447,8 @@
         </w:tc>
       </w:tr>
     </w:tbl>
-    <w:bookmarkEnd w:id="24"/>
-    <w:bookmarkStart w:id="25" w:name="acceptance-per-phase"/>
+    <w:bookmarkEnd w:id="27"/>
+    <w:bookmarkStart w:id="28" w:name="acceptance-per-phase"/>
     <w:p>
       <w:pPr>
         <w:pStyle w:val="Heading1"/>
@@ -5106,7 +6484,7 @@
         <w:t xml:space="preserve"> </w:t>
       </w:r>
       <w:r>
-        <w:t xml:space="preserve">with a valid signature (accepting that the certificate is not CA-trusted yet), shows the</w:t>
+        <w:t xml:space="preserve">with a valid signature (accepting that the certificate is not CA-trusted yet), starting from either an uploaded PDF or an uploaded Word file, with signers listed by name and email and, when order is on, invited strictly one step after another. It shows the</w:t>
       </w:r>
       <w:r>
         <w:t xml:space="preserve"> </w:t>
@@ -5193,8 +6571,8 @@
         <w:t xml:space="preserve">agreed time.</w:t>
       </w:r>
     </w:p>
-    <w:bookmarkEnd w:id="25"/>
-    <w:bookmarkStart w:id="26" w:name="questions-for-you"/>
+    <w:bookmarkEnd w:id="28"/>
+    <w:bookmarkStart w:id="29" w:name="questions-for-you"/>
     <w:p>
       <w:pPr>
         <w:pStyle w:val="Heading1"/>
@@ -5224,13 +6602,13 @@
         </w:numPr>
       </w:pPr>
       <w:r>
-        <w:t xml:space="preserve">Which documents will you send first (name them and say how many pages and signers), so the first</w:t>
-      </w:r>
-      <w:r>
-        <w:t xml:space="preserve"> </w:t>
-      </w:r>
-      <w:r>
-        <w:t xml:space="preserve">template is built from the real thing?</w:t>
+        <w:t xml:space="preserve">Merchant agreement: please supply the real agreement as Word and as PDF, say how many pages and</w:t>
+      </w:r>
+      <w:r>
+        <w:t xml:space="preserve"> </w:t>
+      </w:r>
+      <w:r>
+        <w:t xml:space="preserve">signers it has, and name the fonts it uses (they must be available to the converter).</w:t>
       </w:r>
     </w:p>
     <w:p>
@@ -5287,7 +6665,37 @@
         <w:t xml:space="preserve">Retention period and the deletion exception (section 6).</w:t>
       </w:r>
     </w:p>
-    <w:bookmarkEnd w:id="26"/>
+    <w:p>
+      <w:pPr>
+        <w:pStyle w:val="Compact"/>
+        <w:numPr>
+          <w:ilvl w:val="0"/>
+          <w:numId w:val="1005"/>
+        </w:numPr>
+      </w:pPr>
+      <w:r>
+        <w:t xml:space="preserve">Should sign-in-order be on by default for the Merchant agreements category (Merchant first,</w:t>
+      </w:r>
+      <w:r>
+        <w:t xml:space="preserve"> </w:t>
+      </w:r>
+      <w:r>
+        <w:t xml:space="preserve">Director second)?</w:t>
+      </w:r>
+    </w:p>
+    <w:p>
+      <w:pPr>
+        <w:pStyle w:val="Compact"/>
+        <w:numPr>
+          <w:ilvl w:val="0"/>
+          <w:numId w:val="1005"/>
+        </w:numPr>
+      </w:pPr>
+      <w:r>
+        <w:t xml:space="preserve">Which other categories do you want at the start besides Merchant agreements?</w:t>
+      </w:r>
+    </w:p>
+    <w:bookmarkEnd w:id="29"/>
     <w:sectPr>
       <w:footnotePr>
         <w:numRestart w:val="eachSect"/>
@@ -5580,6 +6988,91 @@
     </w:lvl>
     <w:lvl w:ilvl="8">
       <w:start w:val="1"/>
+      <w:numFmt w:val="decimal"/>
+      <w:lvlText w:val="%9."/>
+      <w:lvlJc w:val="left"/>
+      <w:pPr>
+        <w:ind w:left="6480" w:hanging="360"/>
+      </w:pPr>
+    </w:lvl>
+  </w:abstractNum>
+  <w:abstractNum w:abstractNumId="99410">
+    <w:nsid w:val="00A99410"/>
+    <w:multiLevelType w:val="multilevel"/>
+    <w:lvl w:ilvl="0">
+      <w:start w:val="0"/>
+      <w:numFmt w:val="decimal"/>
+      <w:lvlText w:val="%1."/>
+      <w:lvlJc w:val="left"/>
+      <w:pPr>
+        <w:ind w:left="720" w:hanging="360"/>
+      </w:pPr>
+    </w:lvl>
+    <w:lvl w:ilvl="1">
+      <w:start w:val="0"/>
+      <w:numFmt w:val="decimal"/>
+      <w:lvlText w:val="%2."/>
+      <w:lvlJc w:val="left"/>
+      <w:pPr>
+        <w:ind w:left="1440" w:hanging="360"/>
+      </w:pPr>
+    </w:lvl>
+    <w:lvl w:ilvl="2">
+      <w:start w:val="0"/>
+      <w:numFmt w:val="decimal"/>
+      <w:lvlText w:val="%3."/>
+      <w:lvlJc w:val="left"/>
+      <w:pPr>
+        <w:ind w:left="2160" w:hanging="360"/>
+      </w:pPr>
+    </w:lvl>
+    <w:lvl w:ilvl="3">
+      <w:start w:val="0"/>
+      <w:numFmt w:val="decimal"/>
+      <w:lvlText w:val="%4."/>
+      <w:lvlJc w:val="left"/>
+      <w:pPr>
+        <w:ind w:left="2880" w:hanging="360"/>
+      </w:pPr>
+    </w:lvl>
+    <w:lvl w:ilvl="4">
+      <w:start w:val="0"/>
+      <w:numFmt w:val="decimal"/>
+      <w:lvlText w:val="%5."/>
+      <w:lvlJc w:val="left"/>
+      <w:pPr>
+        <w:ind w:left="3600" w:hanging="360"/>
+      </w:pPr>
+    </w:lvl>
+    <w:lvl w:ilvl="5">
+      <w:start w:val="0"/>
+      <w:numFmt w:val="decimal"/>
+      <w:lvlText w:val="%6."/>
+      <w:lvlJc w:val="left"/>
+      <w:pPr>
+        <w:ind w:left="4320" w:hanging="360"/>
+      </w:pPr>
+    </w:lvl>
+    <w:lvl w:ilvl="6">
+      <w:start w:val="0"/>
+      <w:numFmt w:val="decimal"/>
+      <w:lvlText w:val="%7."/>
+      <w:lvlJc w:val="left"/>
+      <w:pPr>
+        <w:ind w:left="5040" w:hanging="360"/>
+      </w:pPr>
+    </w:lvl>
+    <w:lvl w:ilvl="7">
+      <w:start w:val="0"/>
+      <w:numFmt w:val="decimal"/>
+      <w:lvlText w:val="%8."/>
+      <w:lvlJc w:val="left"/>
+      <w:pPr>
+        <w:ind w:left="5760" w:hanging="360"/>
+      </w:pPr>
+    </w:lvl>
+    <w:lvl w:ilvl="8">
+      <w:start w:val="0"/>
       <w:numFmt w:val="decimal"/>
       <w:lvlText w:val="%9."/>
       <w:lvlJc w:val="left"/>
@@ -5625,33 +7118,33 @@
     </w:lvlOverride>
   </w:num>
   <w:num w:numId="1003">
-    <w:abstractNumId w:val="99411"/>
+    <w:abstractNumId w:val="99410"/>
     <w:lvlOverride w:ilvl="0">
-      <w:startOverride w:val="1"/>
+      <w:startOverride w:val="0"/>
     </w:lvlOverride>
     <w:lvlOverride w:ilvl="1">
-      <w:startOverride w:val="1"/>
+      <w:startOverride w:val="0"/>
     </w:lvlOverride>
     <w:lvlOverride w:ilvl="2">
-      <w:startOverride w:val="1"/>
+      <w:startOverride w:val="0"/>
     </w:lvlOverride>
     <w:lvlOverride w:ilvl="3">
-      <w:startOverride w:val="1"/>
+      <w:startOverride w:val="0"/>
     </w:lvlOverride>
     <w:lvlOverride w:ilvl="4">
-      <w:startOverride w:val="1"/>
+      <w:startOverride w:val="0"/>
     </w:lvlOverride>
     <w:lvlOverride w:ilvl="5">
-      <w:startOverride w:val="1"/>
+      <w:startOverride w:val="0"/>
     </w:lvlOverride>
     <w:lvlOverride w:ilvl="6">
-      <w:startOverride w:val="1"/>
+      <w:startOverride w:val="0"/>
     </w:lvlOverride>
     <w:lvlOverride w:ilvl="7">
-      <w:startOverride w:val="1"/>
+      <w:startOverride w:val="0"/>
     </w:lvlOverride>
     <w:lvlOverride w:ilvl="8">
-      <w:startOverride w:val="1"/>
+      <w:startOverride w:val="0"/>
     </w:lvlOverride>
   </w:num>
   <w:num w:numId="1004">

</xml_diff>

<commit_message>
docs: Doc Sign third revision (answers applied: optional signing order, templates not variants, roles and forwarding, 64-day merchant go-live)
Co-Authored-By: Claude Sonnet 5.5 <noreply@anthropic.com>
</commit_message>
<xml_diff>
--- a/docs/vircle-sign-features.docx
+++ b/docs/vircle-sign-features.docx
@@ -15,7 +15,7 @@
         <w:pStyle w:val="Subtitle"/>
       </w:pPr>
       <w:r>
-        <w:t xml:space="preserve">Document 1 of 3 for review. Requirements, scope and acceptance, revised 6 Oct 2026 (second revision)</w:t>
+        <w:t xml:space="preserve">Document 1 of 3 for review. Requirements, scope and acceptance, revised 6 Oct 2026 (third revision)</w:t>
       </w:r>
     </w:p>
     <w:sdt>
@@ -226,7 +226,7 @@
           <w:i/>
           <w:iCs/>
         </w:rPr>
-        <w:t xml:space="preserve">commercial terms differ by merchant group (template families, section 3.13), the e-invoice tax</w:t>
+        <w:t xml:space="preserve">commercial terms differ by merchant group (handled as separate templates, section 3.13), the e-invoice tax</w:t>
       </w:r>
       <w:r>
         <w:rPr>
@@ -289,6 +289,74 @@
           <w:iCs/>
         </w:rPr>
         <w:t xml:space="preserve">(forms, section 3.12). Appendix A maps every field.</w:t>
+      </w:r>
+    </w:p>
+    <w:p>
+      <w:pPr>
+        <w:pStyle w:val="BodyText"/>
+      </w:pPr>
+      <w:r>
+        <w:rPr>
+          <w:i/>
+          <w:iCs/>
+        </w:rPr>
+        <w:t xml:space="preserve">Third revision, after your answers: signing order is an optional checkbox per document, the code</w:t>
+      </w:r>
+      <w:r>
+        <w:rPr>
+          <w:i/>
+          <w:iCs/>
+        </w:rPr>
+        <w:t xml:space="preserve"> </w:t>
+      </w:r>
+      <w:r>
+        <w:rPr>
+          <w:i/>
+          <w:iCs/>
+        </w:rPr>
+        <w:t xml:space="preserve">and WhatsApp are used only when chosen, Word files are converted to PDF and the PDF is what is</w:t>
+      </w:r>
+      <w:r>
+        <w:rPr>
+          <w:i/>
+          <w:iCs/>
+        </w:rPr>
+        <w:t xml:space="preserve"> </w:t>
+      </w:r>
+      <w:r>
+        <w:rPr>
+          <w:i/>
+          <w:iCs/>
+        </w:rPr>
+        <w:t xml:space="preserve">worked on, the starting categories are Merchant, NDA, Partnership and Sales, and merchant groups are</w:t>
+      </w:r>
+      <w:r>
+        <w:rPr>
+          <w:i/>
+          <w:iCs/>
+        </w:rPr>
+        <w:t xml:space="preserve"> </w:t>
+      </w:r>
+      <w:r>
+        <w:rPr>
+          <w:i/>
+          <w:iCs/>
+        </w:rPr>
+        <w:t xml:space="preserve">simply separate templates you select (the template families and variants of the second revision are</w:t>
+      </w:r>
+      <w:r>
+        <w:rPr>
+          <w:i/>
+          <w:iCs/>
+        </w:rPr>
+        <w:t xml:space="preserve"> </w:t>
+      </w:r>
+      <w:r>
+        <w:rPr>
+          <w:i/>
+          <w:iCs/>
+        </w:rPr>
+        <w:t xml:space="preserve">removed). Section 10 lists what is confirmed, parked and still open.</w:t>
       </w:r>
     </w:p>
     <w:p>
@@ -383,13 +451,13 @@
         <w:t xml:space="preserve"> </w:t>
       </w:r>
       <w:r>
-        <w:t xml:space="preserve">Phase 1B, straight after the core: forms filled in parts, template families and merchant</w:t>
-      </w:r>
-      <w:r>
-        <w:t xml:space="preserve"> </w:t>
-      </w:r>
-      <w:r>
-        <w:t xml:space="preserve">groups. The Merchant Registration add-on goes live when P1b is done.</w:t>
+        <w:t xml:space="preserve">Phase 1B, straight after the core: forms filled in parts, and the Merchant Registration</w:t>
+      </w:r>
+      <w:r>
+        <w:t xml:space="preserve"> </w:t>
+      </w:r>
+      <w:r>
+        <w:t xml:space="preserve">content. The add-on goes live when P1b is done.</w:t>
       </w:r>
     </w:p>
     <w:p>
@@ -522,7 +590,13 @@
         <w:t xml:space="preserve"> </w:t>
       </w:r>
       <w:r>
-        <w:t xml:space="preserve">links; no SMS.</w:t>
+        <w:t xml:space="preserve">links; no SMS. Email is the default; WhatsApp only when the</w:t>
+      </w:r>
+      <w:r>
+        <w:t xml:space="preserve"> </w:t>
+      </w:r>
+      <w:r>
+        <w:t xml:space="preserve">sender chooses it for a signer.</w:t>
       </w:r>
     </w:p>
     <w:p>
@@ -584,13 +658,19 @@
         <w:t xml:space="preserve"> </w:t>
       </w:r>
       <w:r>
-        <w:t xml:space="preserve">conversion service and the converted PDF is what is signed; the original is kept. Exact page</w:t>
-      </w:r>
-      <w:r>
-        <w:t xml:space="preserve"> </w:t>
-      </w:r>
-      <w:r>
-        <w:t xml:space="preserve">layout of a Word file depends on its fonts; where it must be exact, upload a PDF.</w:t>
+        <w:t xml:space="preserve">conversion service and the converted PDF is what is edited and signed, as other signing tools do</w:t>
+      </w:r>
+      <w:r>
+        <w:t xml:space="preserve"> </w:t>
+      </w:r>
+      <w:r>
+        <w:t xml:space="preserve">(confirmed); the original is kept. Exact page layout of a Word file depends on its fonts; where</w:t>
+      </w:r>
+      <w:r>
+        <w:t xml:space="preserve"> </w:t>
+      </w:r>
+      <w:r>
+        <w:t xml:space="preserve">it must be exact, upload a PDF.</w:t>
       </w:r>
     </w:p>
     <w:p>
@@ -1324,7 +1404,39 @@
               <w:t xml:space="preserve"> </w:t>
             </w:r>
             <w:r>
-              <w:t xml:space="preserve">per template or document (for example Merchant, Director). Each field belongs to a role. Up to 6 roles. Roles are filled from the signing list (F-66).</w:t>
+              <w:t xml:space="preserve">per template or document (for example Merchant, Director). Each field belongs to a role. Up to 6 roles. A role is either a</w:t>
+            </w:r>
+            <w:r>
+              <w:t xml:space="preserve"> </w:t>
+            </w:r>
+            <w:r>
+              <w:rPr>
+                <w:b/>
+                <w:bCs/>
+              </w:rPr>
+              <w:t xml:space="preserve">signer</w:t>
+            </w:r>
+            <w:r>
+              <w:t xml:space="preserve"> </w:t>
+            </w:r>
+            <w:r>
+              <w:t xml:space="preserve">or a</w:t>
+            </w:r>
+            <w:r>
+              <w:t xml:space="preserve"> </w:t>
+            </w:r>
+            <w:r>
+              <w:rPr>
+                <w:b/>
+                <w:bCs/>
+              </w:rPr>
+              <w:t xml:space="preserve">filler</w:t>
+            </w:r>
+            <w:r>
+              <w:t xml:space="preserve"> </w:t>
+            </w:r>
+            <w:r>
+              <w:t xml:space="preserve">(completes fields but does not sign). Roles are filled from the signing list (F-66).</w:t>
             </w:r>
           </w:p>
         </w:tc>
@@ -2135,7 +2247,7 @@
               <w:pStyle w:val="Compact"/>
             </w:pPr>
             <w:r>
-              <w:t xml:space="preserve">Invitation by WhatsApp using an approved template message that carries the link. Counts toward the monthly message limit.</w:t>
+              <w:t xml:space="preserve">Invitation by WhatsApp, only when the sender chooses WhatsApp for that signer, using an approved template message that carries the link. Counts toward the monthly message limit.</w:t>
             </w:r>
           </w:p>
         </w:tc>
@@ -2434,7 +2546,7 @@
               <w:t xml:space="preserve"> </w:t>
             </w:r>
             <w:r>
-              <w:t xml:space="preserve">(6 digits by email or WhatsApp, 10 minutes, 5 tries) before the document opens. Set per template or per document.</w:t>
+              <w:t xml:space="preserve">(6 digits by email or WhatsApp, 10 minutes, 5 tries) before the document opens. Used only when chosen, per template or per document; off by default.</w:t>
             </w:r>
           </w:p>
         </w:tc>
@@ -2667,7 +2779,7 @@
               <w:pStyle w:val="Compact"/>
             </w:pPr>
             <w:r>
-              <w:t xml:space="preserve">The signer sees what earlier signers already completed. They can</w:t>
+              <w:t xml:space="preserve">The signer sees what earlier signers already completed. They can download the</w:t>
             </w:r>
             <w:r>
               <w:t xml:space="preserve"> </w:t>
@@ -2677,29 +2789,10 @@
                 <w:b/>
                 <w:bCs/>
               </w:rPr>
-              <w:t xml:space="preserve">download the document</w:t>
-            </w:r>
-            <w:r>
-              <w:t xml:space="preserve"> </w:t>
-            </w:r>
-            <w:r>
-              <w:t xml:space="preserve">at any time (unsigned or in-progress copy), and the</w:t>
-            </w:r>
-            <w:r>
-              <w:t xml:space="preserve"> </w:t>
-            </w:r>
-            <w:r>
-              <w:rPr>
-                <w:b/>
-                <w:bCs/>
-              </w:rPr>
-              <w:t xml:space="preserve">signed copy</w:t>
-            </w:r>
-            <w:r>
-              <w:t xml:space="preserve"> </w:t>
-            </w:r>
-            <w:r>
-              <w:t xml:space="preserve">when finished.</w:t>
+              <w:t xml:space="preserve">signed copy once the document is completed</w:t>
+            </w:r>
+            <w:r>
+              <w:t xml:space="preserve">, and not before.</w:t>
             </w:r>
           </w:p>
         </w:tc>
@@ -4550,13 +4643,13 @@
                 <w:b/>
                 <w:bCs/>
               </w:rPr>
-              <w:t xml:space="preserve">Sign in order</w:t>
-            </w:r>
-            <w:r>
-              <w:t xml:space="preserve"> </w:t>
-            </w:r>
-            <w:r>
-              <w:t xml:space="preserve">switch, chosen when the document is created.</w:t>
+              <w:t xml:space="preserve">“This document needs signing order”</w:t>
+            </w:r>
+            <w:r>
+              <w:t xml:space="preserve"> </w:t>
+            </w:r>
+            <w:r>
+              <w:t xml:space="preserve">checkbox, shown where the signers are listed, as in other signing tools.</w:t>
             </w:r>
             <w:r>
               <w:t xml:space="preserve"> </w:t>
@@ -4566,25 +4659,13 @@
                 <w:b/>
                 <w:bCs/>
               </w:rPr>
-              <w:t xml:space="preserve">On:</w:t>
-            </w:r>
-            <w:r>
-              <w:t xml:space="preserve"> </w:t>
-            </w:r>
-            <w:r>
-              <w:t xml:space="preserve">the document follows the list order; only the first step is invited; each next step is invited automatically when the one before is complete; before their turn a signer’s link shows</w:t>
-            </w:r>
-            <w:r>
-              <w:t xml:space="preserve"> </w:t>
-            </w:r>
-            <w:r>
-              <w:t xml:space="preserve">“Waiting for {name} to sign first”</w:t>
-            </w:r>
-            <w:r>
-              <w:t xml:space="preserve"> </w:t>
-            </w:r>
-            <w:r>
-              <w:t xml:space="preserve">and no document content.</w:t>
+              <w:t xml:space="preserve">Unticked (the default):</w:t>
+            </w:r>
+            <w:r>
+              <w:t xml:space="preserve"> </w:t>
+            </w:r>
+            <w:r>
+              <w:t xml:space="preserve">everyone is invited at once, anyone can sign first, and no order numbers are shown.</w:t>
             </w:r>
             <w:r>
               <w:t xml:space="preserve"> </w:t>
@@ -4594,13 +4675,25 @@
                 <w:b/>
                 <w:bCs/>
               </w:rPr>
-              <w:t xml:space="preserve">Off:</w:t>
-            </w:r>
-            <w:r>
-              <w:t xml:space="preserve"> </w:t>
-            </w:r>
-            <w:r>
-              <w:t xml:space="preserve">everyone is invited at once, anyone can sign first, and the order numbers are ignored.</w:t>
+              <w:t xml:space="preserve">Ticked:</w:t>
+            </w:r>
+            <w:r>
+              <w:t xml:space="preserve"> </w:t>
+            </w:r>
+            <w:r>
+              <w:t xml:space="preserve">order numbers and drag handles appear; only the first signer is invited; each next signer is invited automatically when the one before has signed; before their turn a signer’s link shows</w:t>
+            </w:r>
+            <w:r>
+              <w:t xml:space="preserve"> </w:t>
+            </w:r>
+            <w:r>
+              <w:t xml:space="preserve">“Waiting for {name} to sign first”</w:t>
+            </w:r>
+            <w:r>
+              <w:t xml:space="preserve"> </w:t>
+            </w:r>
+            <w:r>
+              <w:t xml:space="preserve">and no document content. The choice is made for each document; a template or category can only preset the checkbox.</w:t>
             </w:r>
           </w:p>
         </w:tc>
@@ -4651,7 +4744,54 @@
               <w:t xml:space="preserve"> </w:t>
             </w:r>
             <w:r>
-              <w:t xml:space="preserve">and sign in parallel; the next step starts when every signer in the step has finished.</w:t>
+              <w:t xml:space="preserve">and sign in parallel; the next step starts when every signer in the step has finished. (Considered for later; until then each order number holds one signer.)</w:t>
+            </w:r>
+          </w:p>
+        </w:tc>
+        <w:tc>
+          <w:tcPr/>
+          <w:p>
+            <w:pPr>
+              <w:pStyle w:val="Compact"/>
+            </w:pPr>
+            <w:r>
+              <w:t xml:space="preserve">P2</w:t>
+            </w:r>
+          </w:p>
+        </w:tc>
+      </w:tr>
+      <w:tr>
+        <w:tc>
+          <w:tcPr/>
+          <w:p>
+            <w:pPr>
+              <w:pStyle w:val="Compact"/>
+            </w:pPr>
+            <w:r>
+              <w:t xml:space="preserve">F-69</w:t>
+            </w:r>
+          </w:p>
+        </w:tc>
+        <w:tc>
+          <w:tcPr/>
+          <w:p>
+            <w:pPr>
+              <w:pStyle w:val="Compact"/>
+            </w:pPr>
+            <w:r>
+              <w:t xml:space="preserve">While order is on: reminders go only to the current step’s signers; a decline stops the chain and tells the sender; expiry applies to the whole document; a countersigner inside Halo sees the document under</w:t>
+            </w:r>
+            <w:r>
+              <w:t xml:space="preserve"> </w:t>
+            </w:r>
+            <w:r>
+              <w:t xml:space="preserve">“Awaiting my signature”</w:t>
+            </w:r>
+            <w:r>
+              <w:t xml:space="preserve"> </w:t>
+            </w:r>
+            <w:r>
+              <w:t xml:space="preserve">only when their step begins.</w:t>
             </w:r>
           </w:p>
         </w:tc>
@@ -4675,30 +4815,30 @@
               <w:pStyle w:val="Compact"/>
             </w:pPr>
             <w:r>
-              <w:t xml:space="preserve">F-69</w:t>
-            </w:r>
-          </w:p>
-        </w:tc>
-        <w:tc>
-          <w:tcPr/>
-          <w:p>
-            <w:pPr>
-              <w:pStyle w:val="Compact"/>
-            </w:pPr>
-            <w:r>
-              <w:t xml:space="preserve">While order is on: reminders go only to the current step’s signers; a decline stops the chain and tells the sender; expiry applies to the whole document; a countersigner inside Halo sees the document under</w:t>
-            </w:r>
-            <w:r>
-              <w:t xml:space="preserve"> </w:t>
-            </w:r>
-            <w:r>
-              <w:t xml:space="preserve">“Awaiting my signature”</w:t>
-            </w:r>
-            <w:r>
-              <w:t xml:space="preserve"> </w:t>
-            </w:r>
-            <w:r>
-              <w:t xml:space="preserve">only when their step begins.</w:t>
+              <w:t xml:space="preserve">F-70</w:t>
+            </w:r>
+          </w:p>
+        </w:tc>
+        <w:tc>
+          <w:tcPr/>
+          <w:p>
+            <w:pPr>
+              <w:pStyle w:val="Compact"/>
+            </w:pPr>
+            <w:r>
+              <w:t xml:space="preserve">After sending: a signer not yet invited can be renamed, re-addressed or moved to a later position; the current or a finished signer can only be replaced with</w:t>
+            </w:r>
+            <w:r>
+              <w:t xml:space="preserve"> </w:t>
+            </w:r>
+            <w:r>
+              <w:t xml:space="preserve">“change recipient”</w:t>
+            </w:r>
+            <w:r>
+              <w:t xml:space="preserve"> </w:t>
+            </w:r>
+            <w:r>
+              <w:t xml:space="preserve">(new link, same position). The order switch itself cannot be flipped after sending: void and send again.</w:t>
             </w:r>
           </w:p>
         </w:tc>
@@ -4722,30 +4862,27 @@
               <w:pStyle w:val="Compact"/>
             </w:pPr>
             <w:r>
-              <w:t xml:space="preserve">F-70</w:t>
-            </w:r>
-          </w:p>
-        </w:tc>
-        <w:tc>
-          <w:tcPr/>
-          <w:p>
-            <w:pPr>
-              <w:pStyle w:val="Compact"/>
-            </w:pPr>
-            <w:r>
-              <w:t xml:space="preserve">After sending: a signer not yet invited can be renamed, re-addressed or moved to a later position; the current or a finished signer can only be replaced with</w:t>
-            </w:r>
-            <w:r>
-              <w:t xml:space="preserve"> </w:t>
-            </w:r>
-            <w:r>
-              <w:t xml:space="preserve">“change recipient”</w:t>
-            </w:r>
-            <w:r>
-              <w:t xml:space="preserve"> </w:t>
-            </w:r>
-            <w:r>
-              <w:t xml:space="preserve">(new link, same position). The order switch itself cannot be flipped after sending: void and send again.</w:t>
+              <w:t xml:space="preserve">F-71</w:t>
+            </w:r>
+          </w:p>
+        </w:tc>
+        <w:tc>
+          <w:tcPr/>
+          <w:p>
+            <w:pPr>
+              <w:pStyle w:val="Compact"/>
+            </w:pPr>
+            <w:r>
+              <w:t xml:space="preserve">The list and the order are recorded in the sealed record: the completion certificate lists signers in signing order with their times, and the audit trail records each invitation as</w:t>
+            </w:r>
+            <w:r>
+              <w:t xml:space="preserve"> </w:t>
+            </w:r>
+            <w:r>
+              <w:t xml:space="preserve">“invited because {name} finished”</w:t>
+            </w:r>
+            <w:r>
+              <w:t xml:space="preserve">.</w:t>
             </w:r>
           </w:p>
         </w:tc>
@@ -4769,50 +4906,6 @@
               <w:pStyle w:val="Compact"/>
             </w:pPr>
             <w:r>
-              <w:t xml:space="preserve">F-71</w:t>
-            </w:r>
-          </w:p>
-        </w:tc>
-        <w:tc>
-          <w:tcPr/>
-          <w:p>
-            <w:pPr>
-              <w:pStyle w:val="Compact"/>
-            </w:pPr>
-            <w:r>
-              <w:t xml:space="preserve">The list and the order are recorded in the sealed record: the completion certificate lists signers in signing order with their times, and the audit trail records each invitation as</w:t>
-            </w:r>
-            <w:r>
-              <w:t xml:space="preserve"> </w:t>
-            </w:r>
-            <w:r>
-              <w:t xml:space="preserve">“invited because {name} finished”</w:t>
-            </w:r>
-            <w:r>
-              <w:t xml:space="preserve">.</w:t>
-            </w:r>
-          </w:p>
-        </w:tc>
-        <w:tc>
-          <w:tcPr/>
-          <w:p>
-            <w:pPr>
-              <w:pStyle w:val="Compact"/>
-            </w:pPr>
-            <w:r>
-              <w:t xml:space="preserve">P1</w:t>
-            </w:r>
-          </w:p>
-        </w:tc>
-      </w:tr>
-      <w:tr>
-        <w:tc>
-          <w:tcPr/>
-          <w:p>
-            <w:pPr>
-              <w:pStyle w:val="Compact"/>
-            </w:pPr>
-            <w:r>
               <w:t xml:space="preserve">F-72</w:t>
             </w:r>
           </w:p>
@@ -4824,7 +4917,7 @@
               <w:pStyle w:val="Compact"/>
             </w:pPr>
             <w:r>
-              <w:t xml:space="preserve">A template stores its roles and default order and switch setting; the wizard prefills them and the sender may change them for this document. A role can be an internal Halo user (countersigner).</w:t>
+              <w:t xml:space="preserve">A template stores its roles and an optional preset for the signing-order checkbox; the wizard prefills them and the sender may change them for this document. A role can be an internal Halo user (countersigner).</w:t>
             </w:r>
           </w:p>
         </w:tc>
@@ -5217,7 +5310,20 @@
               <w:t xml:space="preserve"> </w:t>
             </w:r>
             <w:r>
-              <w:t xml:space="preserve">Every template and document has a category (for example Merchant agreements, Employment, Vendors, General). Workspaces create, rename and archive their own. Lists filter by category. A category carries defaults that override the workspace defaults: expiry, reminders, code required, sign-in-order on or off, consent wording, retention.</w:t>
+              <w:t xml:space="preserve">Every template and document has a category (the starting set is</w:t>
+            </w:r>
+            <w:r>
+              <w:t xml:space="preserve"> </w:t>
+            </w:r>
+            <w:r>
+              <w:rPr>
+                <w:b/>
+                <w:bCs/>
+              </w:rPr>
+              <w:t xml:space="preserve">Merchant agreements, NDA, Partnership and Sales</w:t>
+            </w:r>
+            <w:r>
+              <w:t xml:space="preserve">). Workspaces create, rename and archive their own. Lists filter by category. A category carries defaults that override the workspace defaults: expiry, reminders, code required, a preset for the signing-order checkbox, consent wording, retention. The four starting categories exist for every workspace using Doc Sign; Merchant agreements is filled by the Merchant Registration add-on and the others start empty for the workspace’s own templates.</w:t>
             </w:r>
           </w:p>
         </w:tc>
@@ -5422,7 +5528,7 @@
         <w:t xml:space="preserve">Merchant agreements</w:t>
       </w:r>
       <w:r>
-        <w:t xml:space="preserve">; the family</w:t>
+        <w:t xml:space="preserve">; the template</w:t>
       </w:r>
       <w:r>
         <w:t xml:space="preserve"> </w:t>
@@ -5435,16 +5541,13 @@
         <w:t xml:space="preserve">Merchant Application</w:t>
       </w:r>
       <w:r>
-        <w:t xml:space="preserve"> </w:t>
-      </w:r>
-      <w:r>
-        <w:t xml:space="preserve">with variants for Merchant group A, B and C (you provide the real files and</w:t>
-      </w:r>
-      <w:r>
-        <w:t xml:space="preserve"> </w:t>
-      </w:r>
-      <w:r>
-        <w:t xml:space="preserve">terms); the form with its parts and data fields (Appendix A), including the new</w:t>
+        <w:t xml:space="preserve">, built from your sample, with the form and its parts (Appendix A) including</w:t>
+      </w:r>
+      <w:r>
+        <w:t xml:space="preserve"> </w:t>
+      </w:r>
+      <w:r>
+        <w:t xml:space="preserve">the new</w:t>
       </w:r>
       <w:r>
         <w:t xml:space="preserve"> </w:t>
@@ -5454,52 +5557,31 @@
           <w:b/>
           <w:bCs/>
         </w:rPr>
-        <w:t xml:space="preserve">e-invoice and tax</w:t>
-      </w:r>
-      <w:r>
-        <w:rPr>
-          <w:b/>
-          <w:bCs/>
-        </w:rPr>
-        <w:t xml:space="preserve"> </w:t>
-      </w:r>
-      <w:r>
-        <w:rPr>
-          <w:b/>
-          <w:bCs/>
-        </w:rPr>
-        <w:t xml:space="preserve">details</w:t>
-      </w:r>
-      <w:r>
-        <w:t xml:space="preserve"> </w:t>
-      </w:r>
-      <w:r>
-        <w:t xml:space="preserve">part; the template</w:t>
-      </w:r>
-      <w:r>
-        <w:t xml:space="preserve"> </w:t>
-      </w:r>
-      <w:r>
-        <w:rPr>
-          <w:i/>
-          <w:iCs/>
-        </w:rPr>
-        <w:t xml:space="preserve">Data Processing Terms</w:t>
-      </w:r>
-      <w:r>
-        <w:t xml:space="preserve">; contact fields for every mapped answer;</w:t>
-      </w:r>
-      <w:r>
-        <w:t xml:space="preserve"> </w:t>
-      </w:r>
-      <w:r>
-        <w:t xml:space="preserve">English and Bahasa Melayu wording. Phase 2 adds the onboarding automation recipe and the option</w:t>
-      </w:r>
-      <w:r>
-        <w:t xml:space="preserve"> </w:t>
-      </w:r>
-      <w:r>
-        <w:t xml:space="preserve">lists; Phase 3 the public registration entry.</w:t>
+        <w:t xml:space="preserve">e-invoice and tax details</w:t>
+      </w:r>
+      <w:r>
+        <w:t xml:space="preserve"> </w:t>
+      </w:r>
+      <w:r>
+        <w:t xml:space="preserve">part; contact fields for every mapped answer; English and</w:t>
+      </w:r>
+      <w:r>
+        <w:t xml:space="preserve"> </w:t>
+      </w:r>
+      <w:r>
+        <w:t xml:space="preserve">Bahasa Melayu wording. A template with other fees or terms is made by duplicating it (section 3.13).</w:t>
+      </w:r>
+      <w:r>
+        <w:t xml:space="preserve"> </w:t>
+      </w:r>
+      <w:r>
+        <w:t xml:space="preserve">Phase 2 adds the onboarding automation recipe and the option lists; Phase 3 the public registration</w:t>
+      </w:r>
+      <w:r>
+        <w:t xml:space="preserve"> </w:t>
+      </w:r>
+      <w:r>
+        <w:t xml:space="preserve">entry.</w:t>
       </w:r>
     </w:p>
     <w:bookmarkEnd w:id="21"/>
@@ -6303,13 +6385,13 @@
                 <w:b/>
                 <w:bCs/>
               </w:rPr>
-              <w:t xml:space="preserve">Share a part.</w:t>
-            </w:r>
-            <w:r>
-              <w:t xml:space="preserve"> </w:t>
-            </w:r>
-            <w:r>
-              <w:t xml:space="preserve">The signer can send one part’s link to a colleague (for example finance, for bank and tax details). The colleague sees only that part and cannot sign; their name and email are recorded.</w:t>
+              <w:t xml:space="preserve">Forward.</w:t>
+            </w:r>
+            <w:r>
+              <w:t xml:space="preserve"> </w:t>
+            </w:r>
+            <w:r>
+              <w:t xml:space="preserve">During signing, a signer may forward their turn, or one part of the form, to another person (name and email). The new person sees only what was handed to them; forwarding the whole turn makes them the signer for that role. Every forward is recorded in the audit trail, and the sender can switch forwarding off for a template or a document.</w:t>
             </w:r>
           </w:p>
         </w:tc>
@@ -6394,6 +6476,51 @@
               <w:pStyle w:val="Compact"/>
             </w:pPr>
             <w:r>
+              <w:t xml:space="preserve">F-103</w:t>
+            </w:r>
+          </w:p>
+        </w:tc>
+        <w:tc>
+          <w:tcPr/>
+          <w:p>
+            <w:pPr>
+              <w:pStyle w:val="Compact"/>
+            </w:pPr>
+            <w:r>
+              <w:rPr>
+                <w:b/>
+                <w:bCs/>
+              </w:rPr>
+              <w:t xml:space="preserve">Assign in advance.</w:t>
+            </w:r>
+            <w:r>
+              <w:t xml:space="preserve"> </w:t>
+            </w:r>
+            <w:r>
+              <w:t xml:space="preserve">When preparing, the sender assigns each field, and each part of a form, to a role and names who holds each role, so it is known before sending who signs and who fills what.</w:t>
+            </w:r>
+          </w:p>
+        </w:tc>
+        <w:tc>
+          <w:tcPr/>
+          <w:p>
+            <w:pPr>
+              <w:pStyle w:val="Compact"/>
+            </w:pPr>
+            <w:r>
+              <w:t xml:space="preserve">P1b</w:t>
+            </w:r>
+          </w:p>
+        </w:tc>
+      </w:tr>
+      <w:tr>
+        <w:tc>
+          <w:tcPr/>
+          <w:p>
+            <w:pPr>
+              <w:pStyle w:val="Compact"/>
+            </w:pPr>
+            <w:r>
               <w:t xml:space="preserve">F-97</w:t>
             </w:r>
           </w:p>
@@ -6433,13 +6560,13 @@
       </w:tr>
     </w:tbl>
     <w:bookmarkEnd w:id="22"/>
-    <w:bookmarkStart w:id="23" w:name="template-families-and-merchant-groups"/>
+    <w:bookmarkStart w:id="23" w:name="X1dbdb2023422a50b17e13bf148cf0594e1b763d"/>
     <w:p>
       <w:pPr>
         <w:pStyle w:val="Heading2"/>
       </w:pPr>
       <w:r>
-        <w:t xml:space="preserve">3.13 Template families and merchant groups</w:t>
+        <w:t xml:space="preserve">3.13 Templates for different terms (merchant groups)</w:t>
       </w:r>
     </w:p>
     <w:tbl>
@@ -6515,24 +6642,24 @@
                 <w:b/>
                 <w:bCs/>
               </w:rPr>
-              <w:t xml:space="preserve">Template family with variants.</w:t>
-            </w:r>
-            <w:r>
-              <w:t xml:space="preserve"> </w:t>
-            </w:r>
-            <w:r>
-              <w:t xml:space="preserve">A family (for example Merchant Application) has variants (Merchant group A, B, C). Each variant is a full template with its own wording, fees and key terms. All variants share the family’s form and data fields, so tax details and contacts are identical everywhere.</w:t>
-            </w:r>
-          </w:p>
-        </w:tc>
-        <w:tc>
-          <w:tcPr/>
-          <w:p>
-            <w:pPr>
-              <w:pStyle w:val="Compact"/>
-            </w:pPr>
-            <w:r>
-              <w:t xml:space="preserve">P1b</w:t>
+              <w:t xml:space="preserve">Different terms are different templates.</w:t>
+            </w:r>
+            <w:r>
+              <w:t xml:space="preserve"> </w:t>
+            </w:r>
+            <w:r>
+              <w:t xml:space="preserve">A merchant group, or any case with other fees or clauses, is simply another template in the same category. The sender selects the template when starting a signing process.</w:t>
+            </w:r>
+          </w:p>
+        </w:tc>
+        <w:tc>
+          <w:tcPr/>
+          <w:p>
+            <w:pPr>
+              <w:pStyle w:val="Compact"/>
+            </w:pPr>
+            <w:r>
+              <w:t xml:space="preserve">P1</w:t>
             </w:r>
           </w:p>
         </w:tc>
@@ -6560,24 +6687,24 @@
                 <w:b/>
                 <w:bCs/>
               </w:rPr>
-              <w:t xml:space="preserve">Choosing the variant.</w:t>
-            </w:r>
-            <w:r>
-              <w:t xml:space="preserve"> </w:t>
-            </w:r>
-            <w:r>
-              <w:t xml:space="preserve">When sending, the sender picks the merchant group; from a contact that already has a merchant group the variant is chosen automatically.</w:t>
-            </w:r>
-          </w:p>
-        </w:tc>
-        <w:tc>
-          <w:tcPr/>
-          <w:p>
-            <w:pPr>
-              <w:pStyle w:val="Compact"/>
-            </w:pPr>
-            <w:r>
-              <w:t xml:space="preserve">P1b</w:t>
+              <w:t xml:space="preserve">Duplicate template</w:t>
+            </w:r>
+            <w:r>
+              <w:t xml:space="preserve"> </w:t>
+            </w:r>
+            <w:r>
+              <w:t xml:space="preserve">copies the file, fields, form and placements into a new draft with a new name, so a variant takes minutes to make.</w:t>
+            </w:r>
+          </w:p>
+        </w:tc>
+        <w:tc>
+          <w:tcPr/>
+          <w:p>
+            <w:pPr>
+              <w:pStyle w:val="Compact"/>
+            </w:pPr>
+            <w:r>
+              <w:t xml:space="preserve">P1</w:t>
             </w:r>
           </w:p>
         </w:tc>
@@ -6600,29 +6727,35 @@
             <w:pPr>
               <w:pStyle w:val="Compact"/>
             </w:pPr>
+            <w:r>
+              <w:t xml:space="preserve">Fees and other commercial wording are ordinary text in the template, or</w:t>
+            </w:r>
+            <w:r>
+              <w:t xml:space="preserve"> </w:t>
+            </w:r>
             <w:r>
               <w:rPr>
                 <w:b/>
                 <w:bCs/>
               </w:rPr>
-              <w:t xml:space="preserve">Commercial values as data fields</w:t>
-            </w:r>
-            <w:r>
-              <w:t xml:space="preserve"> </w:t>
-            </w:r>
-            <w:r>
-              <w:t xml:space="preserve">with each variant’s defaults (platform fee for FPX, credit card and debit card, payment channel note, notice period, settlement schedule, free usage period). They print on the document. Changing them for one merchant is off by default and needs an explicit workspace setting.</w:t>
-            </w:r>
-          </w:p>
-        </w:tc>
-        <w:tc>
-          <w:tcPr/>
-          <w:p>
-            <w:pPr>
-              <w:pStyle w:val="Compact"/>
-            </w:pPr>
-            <w:r>
-              <w:t xml:space="preserve">P1b</w:t>
+              <w:t xml:space="preserve">static text the sender writes</w:t>
+            </w:r>
+            <w:r>
+              <w:t xml:space="preserve"> </w:t>
+            </w:r>
+            <w:r>
+              <w:t xml:space="preserve">on the document when the template is set up that way (F-03).</w:t>
+            </w:r>
+          </w:p>
+        </w:tc>
+        <w:tc>
+          <w:tcPr/>
+          <w:p>
+            <w:pPr>
+              <w:pStyle w:val="Compact"/>
+            </w:pPr>
+            <w:r>
+              <w:t xml:space="preserve">P1</w:t>
             </w:r>
           </w:p>
         </w:tc>
@@ -6646,28 +6779,18 @@
               <w:pStyle w:val="Compact"/>
             </w:pPr>
             <w:r>
-              <w:rPr>
-                <w:b/>
-                <w:bCs/>
-              </w:rPr>
-              <w:t xml:space="preserve">Variant management:</w:t>
-            </w:r>
-            <w:r>
-              <w:t xml:space="preserve"> </w:t>
-            </w:r>
-            <w:r>
-              <w:t xml:space="preserve">duplicate a variant, compare two variants side by side, copy fields from another variant by matching labels. Changing terms creates a new version; documents already sent keep theirs.</w:t>
-            </w:r>
-          </w:p>
-        </w:tc>
-        <w:tc>
-          <w:tcPr/>
-          <w:p>
-            <w:pPr>
-              <w:pStyle w:val="Compact"/>
-            </w:pPr>
-            <w:r>
-              <w:t xml:space="preserve">P1b</w:t>
+              <w:t xml:space="preserve">The sealed record names the template, its version and the terms as printed.</w:t>
+            </w:r>
+          </w:p>
+        </w:tc>
+        <w:tc>
+          <w:tcPr/>
+          <w:p>
+            <w:pPr>
+              <w:pStyle w:val="Compact"/>
+            </w:pPr>
+            <w:r>
+              <w:t xml:space="preserve">P1</w:t>
             </w:r>
           </w:p>
         </w:tc>
@@ -6691,18 +6814,18 @@
               <w:pStyle w:val="Compact"/>
             </w:pPr>
             <w:r>
-              <w:t xml:space="preserve">The sealed record states the group, variant and version, and the terms as printed.</w:t>
-            </w:r>
-          </w:p>
-        </w:tc>
-        <w:tc>
-          <w:tcPr/>
-          <w:p>
-            <w:pPr>
-              <w:pStyle w:val="Compact"/>
-            </w:pPr>
-            <w:r>
-              <w:t xml:space="preserve">P1b</w:t>
+              <w:t xml:space="preserve">Compare two templates side by side, and a shared library of form parts reused across templates (for example the e-invoice part).</w:t>
+            </w:r>
+          </w:p>
+        </w:tc>
+        <w:tc>
+          <w:tcPr/>
+          <w:p>
+            <w:pPr>
+              <w:pStyle w:val="Compact"/>
+            </w:pPr>
+            <w:r>
+              <w:t xml:space="preserve">Later</w:t>
             </w:r>
           </w:p>
         </w:tc>
@@ -6834,22 +6957,6 @@
         <w:t xml:space="preserve">“Merchant applicant”</w:t>
       </w:r>
       <w:r>
-        <w:t xml:space="preserve"> </w:t>
-      </w:r>
-      <w:r>
-        <w:t xml:space="preserve">and a</w:t>
-      </w:r>
-      <w:r>
-        <w:t xml:space="preserve"> </w:t>
-      </w:r>
-      <w:r>
-        <w:rPr>
-          <w:b/>
-          <w:bCs/>
-        </w:rPr>
-        <w:t xml:space="preserve">merchant group</w:t>
-      </w:r>
-      <w:r>
         <w:t xml:space="preserve">.</w:t>
       </w:r>
     </w:p>
@@ -6874,7 +6981,7 @@
         <w:t xml:space="preserve"> </w:t>
       </w:r>
       <w:r>
-        <w:t xml:space="preserve">(P2) starts: it sends the</w:t>
+        <w:t xml:space="preserve">(P2) starts: it sends the chosen</w:t>
       </w:r>
       <w:r>
         <w:t xml:space="preserve"> </w:t>
@@ -6890,19 +6997,19 @@
         <w:t xml:space="preserve"> </w:t>
       </w:r>
       <w:r>
-        <w:t xml:space="preserve">variant</w:t>
-      </w:r>
-      <w:r>
-        <w:t xml:space="preserve"> </w:t>
-      </w:r>
-      <w:r>
-        <w:t xml:space="preserve">for that group to the merchant by WhatsApp and email, with the signing list Merchant first,</w:t>
-      </w:r>
-      <w:r>
-        <w:t xml:space="preserve"> </w:t>
-      </w:r>
-      <w:r>
-        <w:t xml:space="preserve">Director second and sign-in-order on. (Before P2 an agent sends it by hand.)</w:t>
+        <w:t xml:space="preserve">template (the one for that merchant’s terms) to the merchant, by email and, if chosen, WhatsApp,</w:t>
+      </w:r>
+      <w:r>
+        <w:t xml:space="preserve"> </w:t>
+      </w:r>
+      <w:r>
+        <w:t xml:space="preserve">with the signers listed and the signing-order checkbox as set on the template. (Before P2 an</w:t>
+      </w:r>
+      <w:r>
+        <w:t xml:space="preserve"> </w:t>
+      </w:r>
+      <w:r>
+        <w:t xml:space="preserve">agent does this by hand from the contact page.)</w:t>
       </w:r>
     </w:p>
     <w:p>
@@ -8000,13 +8107,13 @@
         <w:t xml:space="preserve"> </w:t>
       </w:r>
       <w:r>
-        <w:t xml:space="preserve">sender sees progress per part; answers are written to the contact; and two merchants of different</w:t>
-      </w:r>
-      <w:r>
-        <w:t xml:space="preserve"> </w:t>
-      </w:r>
-      <w:r>
-        <w:t xml:space="preserve">groups receive different fees and terms from the same family.</w:t>
+        <w:t xml:space="preserve">sender sees progress per part; answers are written to the contact; and a second template with</w:t>
+      </w:r>
+      <w:r>
+        <w:t xml:space="preserve"> </w:t>
+      </w:r>
+      <w:r>
+        <w:t xml:space="preserve">different fees, made by duplicating the first, is sent the same way.</w:t>
       </w:r>
     </w:p>
     <w:p>
@@ -8076,13 +8183,418 @@
       </w:r>
     </w:p>
     <w:bookmarkEnd w:id="30"/>
-    <w:bookmarkStart w:id="31" w:name="questions-for-you"/>
+    <w:bookmarkStart w:id="31" w:name="decisions"/>
     <w:p>
       <w:pPr>
         <w:pStyle w:val="Heading1"/>
       </w:pPr>
       <w:r>
-        <w:t xml:space="preserve">10. Questions for you</w:t>
+        <w:t xml:space="preserve">10. Decisions</w:t>
+      </w:r>
+    </w:p>
+    <w:p>
+      <w:pPr>
+        <w:pStyle w:val="FirstParagraph"/>
+      </w:pPr>
+      <w:r>
+        <w:rPr>
+          <w:b/>
+          <w:bCs/>
+        </w:rPr>
+        <w:t xml:space="preserve">Confirmed by you (6 Oct 2026)</w:t>
+      </w:r>
+    </w:p>
+    <w:tbl>
+      <w:tblPr>
+        <w:tblStyle w:val="Table"/>
+        <w:tblW w:type="pct" w:w="5000"/>
+        <w:tblLayout w:type="fixed"/>
+        <w:tblLook w:firstRow="1" w:lastRow="0" w:firstColumn="0" w:lastColumn="0" w:noHBand="0" w:noVBand="0" w:val="0020"/>
+      </w:tblPr>
+      <w:tblGrid>
+        <w:gridCol w:w="3960"/>
+        <w:gridCol w:w="3960"/>
+      </w:tblGrid>
+      <w:tr>
+        <w:trPr>
+          <w:tblHeader w:val="on"/>
+        </w:trPr>
+        <w:tc>
+          <w:tcPr/>
+          <w:p>
+            <w:pPr>
+              <w:pStyle w:val="Compact"/>
+            </w:pPr>
+            <w:r>
+              <w:t xml:space="preserve">Topic</w:t>
+            </w:r>
+          </w:p>
+        </w:tc>
+        <w:tc>
+          <w:tcPr/>
+          <w:p>
+            <w:pPr>
+              <w:pStyle w:val="Compact"/>
+            </w:pPr>
+            <w:r>
+              <w:t xml:space="preserve">Decision</w:t>
+            </w:r>
+          </w:p>
+        </w:tc>
+      </w:tr>
+      <w:tr>
+        <w:tc>
+          <w:tcPr/>
+          <w:p>
+            <w:pPr>
+              <w:pStyle w:val="Compact"/>
+            </w:pPr>
+            <w:r>
+              <w:t xml:space="preserve">Merchant agreement</w:t>
+            </w:r>
+          </w:p>
+        </w:tc>
+        <w:tc>
+          <w:tcPr/>
+          <w:p>
+            <w:pPr>
+              <w:pStyle w:val="Compact"/>
+            </w:pPr>
+            <w:r>
+              <w:t xml:space="preserve">It is a template. Your sample Merchant Application Form is the starting point, with the e-invoice tax details added.</w:t>
+            </w:r>
+          </w:p>
+        </w:tc>
+      </w:tr>
+      <w:tr>
+        <w:tc>
+          <w:tcPr/>
+          <w:p>
+            <w:pPr>
+              <w:pStyle w:val="Compact"/>
+            </w:pPr>
+            <w:r>
+              <w:t xml:space="preserve">Signing order</w:t>
+            </w:r>
+          </w:p>
+        </w:tc>
+        <w:tc>
+          <w:tcPr/>
+          <w:p>
+            <w:pPr>
+              <w:pStyle w:val="Compact"/>
+            </w:pPr>
+            <w:r>
+              <w:t xml:space="preserve">Chosen for each document with a checkbox</w:t>
+            </w:r>
+            <w:r>
+              <w:t xml:space="preserve"> </w:t>
+            </w:r>
+            <w:r>
+              <w:t xml:space="preserve">“This document needs signing order”</w:t>
+            </w:r>
+            <w:r>
+              <w:t xml:space="preserve">, as in other signing tools. Off unless ticked. No fixed order is assumed for the merchant or the director.</w:t>
+            </w:r>
+          </w:p>
+        </w:tc>
+      </w:tr>
+      <w:tr>
+        <w:tc>
+          <w:tcPr/>
+          <w:p>
+            <w:pPr>
+              <w:pStyle w:val="Compact"/>
+            </w:pPr>
+            <w:r>
+              <w:t xml:space="preserve">Signers sharing a step</w:t>
+            </w:r>
+          </w:p>
+        </w:tc>
+        <w:tc>
+          <w:tcPr/>
+          <w:p>
+            <w:pPr>
+              <w:pStyle w:val="Compact"/>
+            </w:pPr>
+            <w:r>
+              <w:t xml:space="preserve">Can be considered later (Phase 2).</w:t>
+            </w:r>
+          </w:p>
+        </w:tc>
+      </w:tr>
+      <w:tr>
+        <w:tc>
+          <w:tcPr/>
+          <w:p>
+            <w:pPr>
+              <w:pStyle w:val="Compact"/>
+            </w:pPr>
+            <w:r>
+              <w:t xml:space="preserve">Countersigner</w:t>
+            </w:r>
+          </w:p>
+        </w:tc>
+        <w:tc>
+          <w:tcPr/>
+          <w:p>
+            <w:pPr>
+              <w:pStyle w:val="Compact"/>
+            </w:pPr>
+            <w:r>
+              <w:t xml:space="preserve">Same rule: signing order is the sender’s choice for each document.</w:t>
+            </w:r>
+          </w:p>
+        </w:tc>
+      </w:tr>
+      <w:tr>
+        <w:tc>
+          <w:tcPr/>
+          <w:p>
+            <w:pPr>
+              <w:pStyle w:val="Compact"/>
+            </w:pPr>
+            <w:r>
+              <w:t xml:space="preserve">Verification code</w:t>
+            </w:r>
+          </w:p>
+        </w:tc>
+        <w:tc>
+          <w:tcPr/>
+          <w:p>
+            <w:pPr>
+              <w:pStyle w:val="Compact"/>
+            </w:pPr>
+            <w:r>
+              <w:t xml:space="preserve">Used only when chosen for a template or document.</w:t>
+            </w:r>
+          </w:p>
+        </w:tc>
+      </w:tr>
+      <w:tr>
+        <w:tc>
+          <w:tcPr/>
+          <w:p>
+            <w:pPr>
+              <w:pStyle w:val="Compact"/>
+            </w:pPr>
+            <w:r>
+              <w:t xml:space="preserve">WhatsApp</w:t>
+            </w:r>
+          </w:p>
+        </w:tc>
+        <w:tc>
+          <w:tcPr/>
+          <w:p>
+            <w:pPr>
+              <w:pStyle w:val="Compact"/>
+            </w:pPr>
+            <w:r>
+              <w:t xml:space="preserve">Used only when the sender chooses it for a signer. Email is the default.</w:t>
+            </w:r>
+          </w:p>
+        </w:tc>
+      </w:tr>
+      <w:tr>
+        <w:tc>
+          <w:tcPr/>
+          <w:p>
+            <w:pPr>
+              <w:pStyle w:val="Compact"/>
+            </w:pPr>
+            <w:r>
+              <w:t xml:space="preserve">Word files</w:t>
+            </w:r>
+          </w:p>
+        </w:tc>
+        <w:tc>
+          <w:tcPr/>
+          <w:p>
+            <w:pPr>
+              <w:pStyle w:val="Compact"/>
+            </w:pPr>
+            <w:r>
+              <w:t xml:space="preserve">Converted to PDF; the PDF version is what is edited and signed.</w:t>
+            </w:r>
+          </w:p>
+        </w:tc>
+      </w:tr>
+      <w:tr>
+        <w:tc>
+          <w:tcPr/>
+          <w:p>
+            <w:pPr>
+              <w:pStyle w:val="Compact"/>
+            </w:pPr>
+            <w:r>
+              <w:t xml:space="preserve">Starting categories</w:t>
+            </w:r>
+          </w:p>
+        </w:tc>
+        <w:tc>
+          <w:tcPr/>
+          <w:p>
+            <w:pPr>
+              <w:pStyle w:val="Compact"/>
+            </w:pPr>
+            <w:r>
+              <w:t xml:space="preserve">Merchant agreements, NDA, Partnership, Sales.</w:t>
+            </w:r>
+          </w:p>
+        </w:tc>
+      </w:tr>
+      <w:tr>
+        <w:tc>
+          <w:tcPr/>
+          <w:p>
+            <w:pPr>
+              <w:pStyle w:val="Compact"/>
+            </w:pPr>
+            <w:r>
+              <w:t xml:space="preserve">Merchant groups</w:t>
+            </w:r>
+          </w:p>
+        </w:tc>
+        <w:tc>
+          <w:tcPr/>
+          <w:p>
+            <w:pPr>
+              <w:pStyle w:val="Compact"/>
+            </w:pPr>
+            <w:r>
+              <w:t xml:space="preserve">No special mechanism. Different terms are different templates, selected when starting a signing process.</w:t>
+            </w:r>
+          </w:p>
+        </w:tc>
+      </w:tr>
+      <w:tr>
+        <w:tc>
+          <w:tcPr/>
+          <w:p>
+            <w:pPr>
+              <w:pStyle w:val="Compact"/>
+            </w:pPr>
+            <w:r>
+              <w:t xml:space="preserve">Who fills and who signs</w:t>
+            </w:r>
+          </w:p>
+        </w:tc>
+        <w:tc>
+          <w:tcPr/>
+          <w:p>
+            <w:pPr>
+              <w:pStyle w:val="Compact"/>
+            </w:pPr>
+            <w:r>
+              <w:t xml:space="preserve">The sender can say in advance which fields and parts are filled or signed by whom (roles), and a signer can forward their turn or a part to someone else (the sender may switch forwarding off).</w:t>
+            </w:r>
+          </w:p>
+        </w:tc>
+      </w:tr>
+      <w:tr>
+        <w:tc>
+          <w:tcPr/>
+          <w:p>
+            <w:pPr>
+              <w:pStyle w:val="Compact"/>
+            </w:pPr>
+            <w:r>
+              <w:t xml:space="preserve">Signer’s download</w:t>
+            </w:r>
+          </w:p>
+        </w:tc>
+        <w:tc>
+          <w:tcPr/>
+          <w:p>
+            <w:pPr>
+              <w:pStyle w:val="Compact"/>
+            </w:pPr>
+            <w:r>
+              <w:t xml:space="preserve">Only after the document is completed.</w:t>
+            </w:r>
+          </w:p>
+        </w:tc>
+      </w:tr>
+      <w:tr>
+        <w:tc>
+          <w:tcPr/>
+          <w:p>
+            <w:pPr>
+              <w:pStyle w:val="Compact"/>
+            </w:pPr>
+            <w:r>
+              <w:t xml:space="preserve">Signing page look</w:t>
+            </w:r>
+          </w:p>
+        </w:tc>
+        <w:tc>
+          <w:tcPr/>
+          <w:p>
+            <w:pPr>
+              <w:pStyle w:val="Compact"/>
+            </w:pPr>
+            <w:r>
+              <w:t xml:space="preserve">Workspace logo and name (my suggestion, accepted).</w:t>
+            </w:r>
+          </w:p>
+        </w:tc>
+      </w:tr>
+      <w:tr>
+        <w:tc>
+          <w:tcPr/>
+          <w:p>
+            <w:pPr>
+              <w:pStyle w:val="Compact"/>
+            </w:pPr>
+            <w:r>
+              <w:t xml:space="preserve">Name in the sidebar</w:t>
+            </w:r>
+          </w:p>
+        </w:tc>
+        <w:tc>
+          <w:tcPr/>
+          <w:p>
+            <w:pPr>
+              <w:pStyle w:val="Compact"/>
+            </w:pPr>
+            <w:r>
+              <w:t xml:space="preserve">“Doc Sign”</w:t>
+            </w:r>
+            <w:r>
+              <w:t xml:space="preserve">.</w:t>
+            </w:r>
+          </w:p>
+        </w:tc>
+      </w:tr>
+    </w:tbl>
+    <w:p>
+      <w:pPr>
+        <w:pStyle w:val="BodyText"/>
+      </w:pPr>
+      <w:r>
+        <w:rPr>
+          <w:b/>
+          <w:bCs/>
+        </w:rPr>
+        <w:t xml:space="preserve">Parked or not needed now:</w:t>
+      </w:r>
+      <w:r>
+        <w:t xml:space="preserve"> </w:t>
+      </w:r>
+      <w:r>
+        <w:t xml:space="preserve">order of the application parts (as drawn in the UX document); asking the legal name once and a trading name only if different (both fields as on your sample); anything else missing from the screens (none for now).</w:t>
+      </w:r>
+    </w:p>
+    <w:p>
+      <w:pPr>
+        <w:pStyle w:val="BodyText"/>
+      </w:pPr>
+      <w:r>
+        <w:rPr>
+          <w:b/>
+          <w:bCs/>
+        </w:rPr>
+        <w:t xml:space="preserve">Still open, because they affect the start:</w:t>
       </w:r>
     </w:p>
     <w:p>
@@ -8094,7 +8606,7 @@
         </w:numPr>
       </w:pPr>
       <w:r>
-        <w:t xml:space="preserve">Confirm or change the six assumptions in section 1.</w:t>
+        <w:t xml:space="preserve">Retention period for signed contracts, and whether they may outlive a deleted workspace.</w:t>
       </w:r>
     </w:p>
     <w:p>
@@ -8106,13 +8618,13 @@
         </w:numPr>
       </w:pPr>
       <w:r>
-        <w:t xml:space="preserve">Merchant agreement: please supply the real agreement as Word and as PDF, say how many pages and</w:t>
-      </w:r>
-      <w:r>
-        <w:t xml:space="preserve"> </w:t>
-      </w:r>
-      <w:r>
-        <w:t xml:space="preserve">signers it has, and name the fonts it uses (they must be available to the converter).</w:t>
+        <w:t xml:space="preserve">Ordering the sealing certificate, and whether a certificate-authority one is needed at launch</w:t>
+      </w:r>
+      <w:r>
+        <w:t xml:space="preserve"> </w:t>
+      </w:r>
+      <w:r>
+        <w:t xml:space="preserve">(legal read on Malaysian e-signature requirements for merchant contracts).</w:t>
       </w:r>
     </w:p>
     <w:p>
@@ -8124,7 +8636,7 @@
         </w:numPr>
       </w:pPr>
       <w:r>
-        <w:t xml:space="preserve">Which fields must a merchant fill, and which of them are sensitive (IC, bank account)?</w:t>
+        <w:t xml:space="preserve">VPS memory and CPU, or permission to measure them.</w:t>
       </w:r>
     </w:p>
     <w:p>
@@ -8136,7 +8648,13 @@
         </w:numPr>
       </w:pPr>
       <w:r>
-        <w:t xml:space="preserve">Who is the countersigner, and must they sign before or after the merchant?</w:t>
+        <w:t xml:space="preserve">Option lists for the form: company registration ID types, e-invoice compliance phases, tax</w:t>
+      </w:r>
+      <w:r>
+        <w:t xml:space="preserve"> </w:t>
+      </w:r>
+      <w:r>
+        <w:t xml:space="preserve">types, the bank list. (Needed before the form is built; until then they are free choices.)</w:t>
       </w:r>
     </w:p>
     <w:p>
@@ -8148,13 +8666,7 @@
         </w:numPr>
       </w:pPr>
       <w:r>
-        <w:t xml:space="preserve">Is WhatsApp the main channel? If so, are you able to get a WhatsApp utility template approved</w:t>
-      </w:r>
-      <w:r>
-        <w:t xml:space="preserve"> </w:t>
-      </w:r>
-      <w:r>
-        <w:t xml:space="preserve">for the invitation message?</w:t>
+        <w:t xml:space="preserve">Is the official company stamp mandatory? (Default: optional upload.)</w:t>
       </w:r>
     </w:p>
     <w:p>
@@ -8166,202 +8678,7 @@
         </w:numPr>
       </w:pPr>
       <w:r>
-        <w:t xml:space="preserve">Retention period and the deletion exception (section 6).</w:t>
-      </w:r>
-    </w:p>
-    <w:p>
-      <w:pPr>
-        <w:pStyle w:val="Compact"/>
-        <w:numPr>
-          <w:ilvl w:val="0"/>
-          <w:numId w:val="1005"/>
-        </w:numPr>
-      </w:pPr>
-      <w:r>
-        <w:t xml:space="preserve">Should sign-in-order be on by default for the Merchant agreements category (Merchant first,</w:t>
-      </w:r>
-      <w:r>
-        <w:t xml:space="preserve"> </w:t>
-      </w:r>
-      <w:r>
-        <w:t xml:space="preserve">Director second)?</w:t>
-      </w:r>
-    </w:p>
-    <w:p>
-      <w:pPr>
-        <w:pStyle w:val="Compact"/>
-        <w:numPr>
-          <w:ilvl w:val="0"/>
-          <w:numId w:val="1005"/>
-        </w:numPr>
-      </w:pPr>
-      <w:r>
-        <w:t xml:space="preserve">Which other categories do you want at the start besides Merchant agreements?</w:t>
-      </w:r>
-    </w:p>
-    <w:p>
-      <w:pPr>
-        <w:pStyle w:val="Compact"/>
-        <w:numPr>
-          <w:ilvl w:val="0"/>
-          <w:numId w:val="1005"/>
-        </w:numPr>
-      </w:pPr>
-      <w:r>
-        <w:t xml:space="preserve">Merchant groups: how many (A, B, C and more), what exactly differs between them (fees only, or</w:t>
-      </w:r>
-      <w:r>
-        <w:t xml:space="preserve"> </w:t>
-      </w:r>
-      <w:r>
-        <w:t xml:space="preserve">clauses too), and who may change fees on one merchant?</w:t>
-      </w:r>
-    </w:p>
-    <w:p>
-      <w:pPr>
-        <w:pStyle w:val="Compact"/>
-        <w:numPr>
-          <w:ilvl w:val="0"/>
-          <w:numId w:val="1005"/>
-        </w:numPr>
-      </w:pPr>
-      <w:r>
-        <w:t xml:space="preserve">The sample application has</w:t>
-      </w:r>
-      <w:r>
-        <w:t xml:space="preserve"> </w:t>
-      </w:r>
-      <w:r>
-        <w:t xml:space="preserve">“Company Name”</w:t>
-      </w:r>
-      <w:r>
-        <w:t xml:space="preserve"> </w:t>
-      </w:r>
-      <w:r>
-        <w:t xml:space="preserve">and</w:t>
-      </w:r>
-      <w:r>
-        <w:t xml:space="preserve"> </w:t>
-      </w:r>
-      <w:r>
-        <w:t xml:space="preserve">“Company Registered Name (If Different)”</w:t>
-      </w:r>
-      <w:r>
-        <w:t xml:space="preserve">, and your</w:t>
-      </w:r>
-      <w:r>
-        <w:t xml:space="preserve"> </w:t>
-      </w:r>
-      <w:r>
-        <w:t xml:space="preserve">online form has</w:t>
-      </w:r>
-      <w:r>
-        <w:t xml:space="preserve"> </w:t>
-      </w:r>
-      <w:r>
-        <w:t xml:space="preserve">“Company Legal Name (as per SSM)”</w:t>
-      </w:r>
-      <w:r>
-        <w:t xml:space="preserve">. Proposal: ask the legal name once and ask a</w:t>
-      </w:r>
-      <w:r>
-        <w:t xml:space="preserve"> </w:t>
-      </w:r>
-      <w:r>
-        <w:t xml:space="preserve">trading name only if different. Confirm.</w:t>
-      </w:r>
-    </w:p>
-    <w:p>
-      <w:pPr>
-        <w:pStyle w:val="Compact"/>
-        <w:numPr>
-          <w:ilvl w:val="0"/>
-          <w:numId w:val="1005"/>
-        </w:numPr>
-      </w:pPr>
-      <w:r>
-        <w:t xml:space="preserve">The application has</w:t>
-      </w:r>
-      <w:r>
-        <w:t xml:space="preserve"> </w:t>
-      </w:r>
-      <w:r>
-        <w:t xml:space="preserve">“GST No.”</w:t>
-      </w:r>
-      <w:r>
-        <w:t xml:space="preserve"> </w:t>
-      </w:r>
-      <w:r>
-        <w:t xml:space="preserve">and the online form has</w:t>
-      </w:r>
-      <w:r>
-        <w:t xml:space="preserve"> </w:t>
-      </w:r>
-      <w:r>
-        <w:t xml:space="preserve">“SST Registration Number”</w:t>
-      </w:r>
-      <w:r>
-        <w:t xml:space="preserve">. Replace GST</w:t>
-      </w:r>
-      <w:r>
-        <w:t xml:space="preserve"> </w:t>
-      </w:r>
-      <w:r>
-        <w:t xml:space="preserve">with SST? Keep both?</w:t>
-      </w:r>
-    </w:p>
-    <w:p>
-      <w:pPr>
-        <w:pStyle w:val="Compact"/>
-        <w:numPr>
-          <w:ilvl w:val="0"/>
-          <w:numId w:val="1005"/>
-        </w:numPr>
-      </w:pPr>
-      <w:r>
-        <w:t xml:space="preserve">Please supply the option lists: company registration ID types, e-invoice compliance phases, tax</w:t>
-      </w:r>
-      <w:r>
-        <w:t xml:space="preserve"> </w:t>
-      </w:r>
-      <w:r>
-        <w:t xml:space="preserve">types, and whether the bank list is a fixed list of Malaysian banks.</w:t>
-      </w:r>
-    </w:p>
-    <w:p>
-      <w:pPr>
-        <w:pStyle w:val="Compact"/>
-        <w:numPr>
-          <w:ilvl w:val="0"/>
-          <w:numId w:val="1005"/>
-        </w:numPr>
-      </w:pPr>
-      <w:r>
-        <w:t xml:space="preserve">Should the official company stamp be mandatory, and is an uploaded image of the stamp acceptable?</w:t>
-      </w:r>
-    </w:p>
-    <w:p>
-      <w:pPr>
-        <w:pStyle w:val="Compact"/>
-        <w:numPr>
-          <w:ilvl w:val="0"/>
-          <w:numId w:val="1005"/>
-        </w:numPr>
-      </w:pPr>
-      <w:r>
-        <w:t xml:space="preserve">Which parts can a merchant pass to a colleague (finance for bank and tax)?</w:t>
-      </w:r>
-    </w:p>
-    <w:p>
-      <w:pPr>
-        <w:pStyle w:val="Compact"/>
-        <w:numPr>
-          <w:ilvl w:val="0"/>
-          <w:numId w:val="1005"/>
-        </w:numPr>
-      </w:pPr>
-      <w:r>
-        <w:t xml:space="preserve">Does Vircle sign the application too (countersign), or only the merchant?</w:t>
+        <w:t xml:space="preserve">WhatsApp template approval, only if WhatsApp will be used for invitations.</w:t>
       </w:r>
     </w:p>
     <w:bookmarkEnd w:id="31"/>
@@ -10697,7 +11014,7 @@
         <w:t xml:space="preserve"> </w:t>
       </w:r>
       <w:r>
-        <w:t xml:space="preserve">(read only, from the merchant group’s variant; the merchant ticks</w:t>
+        <w:t xml:space="preserve">(read only, from the chosen template’s own wording; the merchant ticks</w:t>
       </w:r>
       <w:r>
         <w:t xml:space="preserve"> </w:t>
@@ -10732,7 +11049,7 @@
         <w:t xml:space="preserve"> </w:t>
       </w:r>
       <w:r>
-        <w:t xml:space="preserve">Fees, notice period and settlement schedule are data fields with each variant’s defaults (F-100).</w:t>
+        <w:t xml:space="preserve">Different fees or terms mean a different template (F-98); the values are ordinary text in the template.</w:t>
       </w:r>
     </w:p>
     <w:p>

</xml_diff>